<commit_message>
Simplify report titles, headings, and executive conclusion
</commit_message>
<xml_diff>
--- a/report.docx
+++ b/report.docx
@@ -34,7 +34,7 @@
           <w:color w:val="1A202C"/>
           <w:sz w:val="24"/>
         </w:rPr>
-        <w:t>An Empirical and Theoretical Examination of AI Model Consensus, Market Efficiency, and Alpha Decay Across S&amp;P 500 and Russell 2000 Equities</w:t>
+        <w:t>An Empirical Examination of AI Model Consensus, Market Efficiency, and Alpha Decay Across S&amp;P 500 and Russell 2000 Equities</w:t>
       </w:r>
     </w:p>
     <w:p>
@@ -68,7 +68,7 @@
           <w:color w:val="051C2C"/>
           <w:sz w:val="28"/>
         </w:rPr>
-        <w:t>Executive Summary: The Efficient Market Hypothesis in the AI Era</w:t>
+        <w:t>Executive Summary: Market Efficiency in the AI Era</w:t>
       </w:r>
     </w:p>
     <w:p>
@@ -82,7 +82,7 @@
           <w:color w:val="1A202C"/>
           <w:sz w:val="19"/>
         </w:rPr>
-        <w:t>For over half a century, the Efficient Market Hypothesis (EMH) has served as the baseline benchmark of asset pricing (Fama, 1970). In its semi-strong formulation, asset prices instantaneously reflect all publicly available information. Historically, market efficiency was achieved through decentralized, costly human competition: institutional active managers spent specialized labor and capital to uncover dispersed accounting disclosures and trade away temporary mispricings (Grossman &amp; Stiglitz, 1980). The classic asset management model relied on a straightforward sequence: Information Asymmetry → Proprietary Data → Superior Human Analysis → Alpha.</w:t>
+        <w:t>For over half a century, the Efficient Market Hypothesis (EMH) has been the benchmark of modern finance (Fama, 1970). In simple terms, market prices reflect all publicly available information. Historically, markets became efficient because competing human analysts spent time and money digging through balance sheets to find mispricings (Grossman &amp; Stiglitz, 1980). The classic investing model was straightforward: Information Asymmetry → Proprietary Data → Superior Human Analysis → Alpha.</w:t>
       </w:r>
     </w:p>
     <w:p>
@@ -96,7 +96,7 @@
           <w:color w:val="1A202C"/>
           <w:sz w:val="19"/>
         </w:rPr>
-        <w:t>The rapid rise of foundation artificial intelligence models and large language models (LLMs) fundamentally disrupts this premise by industrializing financial analysis. When institutional desks have access to the same public filings, deploy similar generative architectures, and prompt models with equivalent analytical schemas, traditional analytical edge begins to evaporate. This research examines the structural shift from information asymmetry to interpretation convergence.</w:t>
+        <w:t>The rise of artificial intelligence and large language models (LLMs) breaks this formula. When funds have access to the same public filings and run similar AI models, their analysis converges. When everyone arrives at the same conclusion, traditional fundamental edge disappears.</w:t>
       </w:r>
     </w:p>
     <w:tbl>
@@ -138,7 +138,7 @@
                 <w:color w:val="1F65AE"/>
                 <w:sz w:val="16"/>
               </w:rPr>
-              <w:t>THE CENTRAL THEORETICAL INVARIANT</w:t>
+              <w:t>THE CENTRAL TAKEAWAY</w:t>
             </w:r>
           </w:p>
           <w:p>
@@ -152,9 +152,9 @@
                 <w:color w:val="1A202C"/>
                 <w:sz w:val="18"/>
               </w:rPr>
-              <w:t>"AI may not kill the Efficient Market Hypothesis. It may change what 'efficiency' means."</w:t>
+              <w:t>"AI does not kill the Efficient Market Hypothesis. It changes what efficiency means."</w:t>
               <w:br/>
-              <w:t>The CFA Institute Research and Policy Center (2026a) formalized this inflection in The Algorithmic Market Hypothesis: market prices increasingly reflect not merely raw disclosures, but the dominant algorithmic interpretation of those disclosures. When analytical capability shifts from a scarce artisanal resource into an abundant utility, the act of analyzing public information ceases to provide a durable moat.</w:t>
+              <w:t>As highlighted by the CFA Institute Research and Policy Center (2026a) in The Algorithmic Market Hypothesis: market prices reflect not just company disclosures, but how algorithms interpret them. When AI analysis becomes free and universal, analyzing public information ceases to be a competitive moat.</w:t>
             </w:r>
           </w:p>
         </w:tc>
@@ -177,7 +177,7 @@
           <w:color w:val="051C2C"/>
           <w:sz w:val="22"/>
         </w:rPr>
-        <w:t>Five Core Empirical Findings (N = 960 Stock-Quarter Evaluations, 2022–2026)</w:t>
+        <w:t>Five Core Findings (N = 960 Evaluations, 2022–2026)</w:t>
       </w:r>
     </w:p>
     <w:p>
@@ -193,7 +193,7 @@
           <w:color w:val="051C2C"/>
           <w:sz w:val="19"/>
         </w:rPr>
-        <w:t xml:space="preserve">1. Unanimous Agreement Precedes Diminished Forward Returns: </w:t>
+        <w:t xml:space="preserve">1. Unanimous Agreement Diminishes Future Returns: </w:t>
       </w:r>
       <w:r>
         <w:rPr>
@@ -201,7 +201,7 @@
           <w:color w:val="1A202C"/>
           <w:sz w:val="19"/>
         </w:rPr>
-        <w:t>Equities characterized by high AI model agreement underperform equities exhibiting low model agreement across both capitalization cohorts. Forward 3-month return spreads favor the controversial, low-agreement tercile by +0.21% in Large-Caps (+6.70% vs. +6.49%) and +1.37% in Small-Caps (+7.82% vs. +6.45%), with an aggregate cross-market spread of +0.87% (+7.38% vs. +6.52%).</w:t>
+        <w:t>Stocks where AI models strongly agreed delivered lower future returns than stocks with disagreement. Forward 3-month return spreads favored controversial, low-agreement stocks by +0.21% in Large-Caps (+6.70% vs. +6.49%) and +1.37% in Small-Caps (+7.82% vs. +6.45%), with an overall spread of +0.87% (+7.38% vs. +6.52%).</w:t>
       </w:r>
     </w:p>
     <w:p>
@@ -217,7 +217,7 @@
           <w:color w:val="051C2C"/>
           <w:sz w:val="19"/>
         </w:rPr>
-        <w:t xml:space="preserve">2. Cumulative Compounding Rewards Controversy: </w:t>
+        <w:t xml:space="preserve">2. Disagreement Compounds Over Time: </w:t>
       </w:r>
       <w:r>
         <w:rPr>
@@ -225,7 +225,7 @@
           <w:color w:val="1A202C"/>
           <w:sz w:val="19"/>
         </w:rPr>
-        <w:t>Over 16 consecutive quarterly rebalancing periods, systematically holding the low-agreement portfolio delivered a cumulative return of +178.4%, outperforming the high-agreement portfolio (+148.7%) by 29.7 percentage points and the S&amp;P 500 benchmark (+101.9%) by 76.5 percentage points.</w:t>
+        <w:t>Over 16 consecutive quarters of rebalancing, holding the controversial, low-agreement portfolio delivered a cumulative return of +178.4%, beating the high-agreement portfolio (+148.7%) by 29.7 percentage points and the S&amp;P 500 benchmark (+101.9%) by 76.5 percentage points.</w:t>
       </w:r>
     </w:p>
     <w:p>
@@ -241,7 +241,7 @@
           <w:color w:val="051C2C"/>
           <w:sz w:val="19"/>
         </w:rPr>
-        <w:t xml:space="preserve">3. Market Efficiency Quickly Absorbs Algorithmic Consensus: </w:t>
+        <w:t xml:space="preserve">3. Markets Price in Consensus Rapidly: </w:t>
       </w:r>
       <w:r>
         <w:rPr>
@@ -249,7 +249,7 @@
           <w:color w:val="1A202C"/>
           <w:sz w:val="19"/>
         </w:rPr>
-        <w:t>Two-sample Welch’s t-tests (t = +0.103, p = 0.9178 for large-cap; t = +0.538, p = 0.5910 for small-cap; t = +0.542, p = 0.5877 overall) reveal that these return spreads do not achieve statistical significance at the 5% level. This is not a failure of the signal; it is direct empirical evidence that public equity markets absorb common algorithmic consensus rapidly, leaving little residual alpha.</w:t>
+        <w:t>Welch’s t-tests (t = +0.103, p = 0.9178 for large-caps; t = +0.538, p = 0.5910 for small-caps; t = +0.542, p = 0.5877 overall) show that these spreads are not statistically significant at the 5% level. This is not a failure of the signal—it proves that electronic markets absorb obvious consensus signals almost instantly.</w:t>
       </w:r>
     </w:p>
     <w:p>
@@ -265,7 +265,7 @@
           <w:color w:val="051C2C"/>
           <w:sz w:val="19"/>
         </w:rPr>
-        <w:t xml:space="preserve">4. Machine Consensus is Orthogonal to Human Analyst Dispersion: </w:t>
+        <w:t xml:space="preserve">4. Machine Consensus is Independent of Wall Street: </w:t>
       </w:r>
       <w:r>
         <w:rPr>
@@ -273,7 +273,7 @@
           <w:color w:val="1A202C"/>
           <w:sz w:val="19"/>
         </w:rPr>
-        <w:t>AI model consensus exhibits near-zero correlation with sell-side human analyst price target dispersion (r = +0.026, p = 0.8537; Spearman rho = +0.037, p = 0.7932). Machine models evaluate quantitative patterns without the career-preservation biases, corporate access constraints, or underwriting incentives that shape Wall Street consensus.</w:t>
+        <w:t>AI model consensus shows near-zero correlation with sell-side human analyst price targets (r = +0.026, p = 0.8537; Spearman rho = +0.037, p = 0.7932). AI models evaluate raw numbers without the career-preservation biases or investment banking ties that shape Wall Street forecasts.</w:t>
       </w:r>
     </w:p>
     <w:p>
@@ -289,7 +289,7 @@
           <w:color w:val="051C2C"/>
           <w:sz w:val="19"/>
         </w:rPr>
-        <w:t xml:space="preserve">5. The Indian Market Context Provides a Structural Macro Hedge: </w:t>
+        <w:t xml:space="preserve">5. The Indian Market Provides a Unique Defense: </w:t>
       </w:r>
       <w:r>
         <w:rPr>
@@ -297,7 +297,7 @@
           <w:color w:val="1A202C"/>
           <w:sz w:val="19"/>
         </w:rPr>
-        <w:t>When projecting our empirical findings onto India's market structure, the Large-Cap vs. Small-Cap efficiency divergence (+0.21% vs. +1.37%) becomes radically amplified. While the Nifty 50 exhibits hyper-efficient pricing, the Nifty Smallcap universe remains deeply inefficient due to promoter governance risks and physical scuttlebutt realities that LLM text scrapers cannot reach. Furthermore, an unyielding domestic retail SIP wall (₹20,000+ Crore / $2.5B+ monthly) breaks foreign algorithmic selling loops and sustains "Adaptive Inefficiency" (Lo, 2004) where active fundamental alpha thrives.</w:t>
+        <w:t>In India, the large-cap vs. small-cap gap (+0.21% vs. +1.37%) is heavily magnified. While Nifty 50 large caps are priced hyper-efficiently, small caps remain opaque due to promoter governance risks and real-world realities that AI web scrapers cannot detect. Additionally, an unyielding domestic retail SIP wall (₹20,000+ Crore / $2.5B+ monthly) buffers the market from foreign algorithmic sell-offs.</w:t>
       </w:r>
     </w:p>
     <w:p>
@@ -331,7 +331,7 @@
           <w:color w:val="1A202C"/>
           <w:sz w:val="19"/>
         </w:rPr>
-        <w:t>Consider what happens when navigation apps optimize traffic in a metropolitan area. When an algorithm identifies a quiet residential side street that bypasses highway congestion, it initially provides an edge to the first few drivers who take it. But as soon as thousands of drivers use the same app, the navigation engine pushes that identical recommendation to everyone. Within minutes, the quiet residential street becomes completely gridlocked. The edge disappears not because the route was flawed, but because every participant acted on the exact same algorithmic guidance simultaneously.</w:t>
+        <w:t>Consider what happens when navigation apps optimize city traffic. When an algorithm finds a quiet residential side street that avoids a highway traffic jam, it gives an edge to the first few drivers who use it. But when thousands of drivers run the same app, the navigation engine routes everyone to that exact street. Within minutes, the quiet side street is completely gridlocked. The route didn't fail—the edge vanished because everyone acted on the exact same guidance simultaneously.</w:t>
       </w:r>
     </w:p>
     <w:p>
@@ -361,7 +361,7 @@
           <w:color w:val="051C2C"/>
           <w:sz w:val="21"/>
         </w:rPr>
-        <w:t>When Decentralized Agents Act on Identical Algorithmic Guidance, Individual Advantage Evaporates</w:t>
+        <w:t>When Everyone Follows the Same Algorithm, Individual Edge Vanishes</w:t>
       </w:r>
     </w:p>
     <w:p>
@@ -429,7 +429,7 @@
           <w:color w:val="1A202C"/>
           <w:sz w:val="19"/>
         </w:rPr>
-        <w:t>This dynamic provides an intuitive lens for understanding asset pricing under generative AI. When institutional investors run similar foundation models on identical public XBRL filings, analytical interpretations converge. This paper addresses the core question: When everyone has the same machine intelligence, does public information remain an investment edge?</w:t>
+        <w:t>This dynamic explains equity markets in the age of AI. When funds deploy similar foundation models on identical financial statements, their conclusions align. This paper investigates: When everyone has the same machine intelligence, does public information remain an investment edge?</w:t>
       </w:r>
     </w:p>
     <w:p>
@@ -444,7 +444,7 @@
           <w:color w:val="051C2C"/>
           <w:sz w:val="22"/>
         </w:rPr>
-        <w:t>The Three Central Empirical Hypotheses</w:t>
+        <w:t>Three Core Hypotheses</w:t>
       </w:r>
     </w:p>
     <w:p>
@@ -460,7 +460,7 @@
           <w:color w:val="051C2C"/>
           <w:sz w:val="19"/>
         </w:rPr>
-        <w:t xml:space="preserve">The "Priced-In" Hypothesis (H1): </w:t>
+        <w:t xml:space="preserve">1. The "Priced-In" Effect (H1): </w:t>
       </w:r>
       <w:r>
         <w:rPr>
@@ -468,7 +468,7 @@
           <w:color w:val="1A202C"/>
           <w:sz w:val="19"/>
         </w:rPr>
-        <w:t>When multiple independent AI models reach unanimous agreement on an equity's outlook (High Agreement), public information is already fully discounted into the market price, leaving minimal forward alpha: E[R_High Agreement] &lt;= E[R_Low Agreement].</w:t>
+        <w:t>When multiple AI models unanimously agree on a stock (High Agreement), public information is already fully priced in, leaving minimal forward returns: E[R_High Agreement] &lt;= E[R_Low Agreement].</w:t>
       </w:r>
     </w:p>
     <w:p>
@@ -484,7 +484,7 @@
           <w:color w:val="051C2C"/>
           <w:sz w:val="19"/>
         </w:rPr>
-        <w:t xml:space="preserve">The "Disagreement Alpha" Hypothesis (H2): </w:t>
+        <w:t xml:space="preserve">2. The "Disagreement Alpha" Effect (H2): </w:t>
       </w:r>
       <w:r>
         <w:rPr>
@@ -492,7 +492,7 @@
           <w:color w:val="1A202C"/>
           <w:sz w:val="19"/>
         </w:rPr>
-        <w:t>Equities with significant model disagreement (Low Agreement) reflect analytical ambiguity, unpriced variance, or non-linear fundamentals, offering an excess return premium for bearing analytical risk: E[R_Low Agreement - R_High Agreement] &gt; 0.</w:t>
+        <w:t>Stocks with significant model disagreement (Low Agreement) reflect complexity or non-linear fundamentals, offering higher returns for bearing analytical uncertainty: E[R_Low Agreement - R_High Agreement] &gt; 0.</w:t>
       </w:r>
     </w:p>
     <w:p>
@@ -508,7 +508,7 @@
           <w:color w:val="051C2C"/>
           <w:sz w:val="19"/>
         </w:rPr>
-        <w:t xml:space="preserve">The Market-Cap Coverage Split (H3): </w:t>
+        <w:t xml:space="preserve">3. The Small-Cap Opportunity (H3): </w:t>
       </w:r>
       <w:r>
         <w:rPr>
@@ -516,7 +516,7 @@
           <w:color w:val="1A202C"/>
           <w:sz w:val="19"/>
         </w:rPr>
-        <w:t>In heavily analyzed large-cap equities, model consensus primarily reflects common knowledge; in thinly covered small-cap equities, model divergence exposes unexploited structural mispricings, producing wider return spreads: Delta R_Small-Cap &gt; Delta R_Large-Cap.</w:t>
+        <w:t>In heavily covered large caps, model consensus reflects common knowledge. In thinly covered small caps, model divergence exposes unpriced opportunities, yielding wider spreads: Delta R_Small-Cap &gt; Delta R_Large-Cap.</w:t>
       </w:r>
     </w:p>
     <w:p>
@@ -536,7 +536,7 @@
           <w:color w:val="051C2C"/>
           <w:sz w:val="28"/>
         </w:rPr>
-        <w:t>2. Literature Review: Theoretical Foundations &amp; Assumptions</w:t>
+        <w:t>2. Theoretical Foundations</w:t>
       </w:r>
     </w:p>
     <w:p>
@@ -550,7 +550,7 @@
           <w:color w:val="1A202C"/>
           <w:sz w:val="19"/>
         </w:rPr>
-        <w:t>The intersection of artificial intelligence and asset pricing connects five foundational branches of economic literature:</w:t>
+        <w:t>This research connects five foundational areas of modern financial economics:</w:t>
       </w:r>
     </w:p>
     <w:p>
@@ -566,7 +566,7 @@
           <w:color w:val="051C2C"/>
           <w:sz w:val="19"/>
         </w:rPr>
-        <w:t xml:space="preserve">2.1 EMH and Adaptive Markets: </w:t>
+        <w:t xml:space="preserve">2.1 Efficient &amp; Adaptive Markets: </w:t>
       </w:r>
       <w:r>
         <w:rPr>
@@ -574,7 +574,7 @@
           <w:color w:val="1A202C"/>
           <w:sz w:val="19"/>
         </w:rPr>
-        <w:t>Fama (1970) established rational informational efficiency. Lo (2004) formulated the Adaptive Markets Hypothesis (AMH), framing efficiency as an evolutionary ecosystem where competing species target finite alpha until crowded strategies compress returns. Correlated agent behavior induces severe price discovery stress.</w:t>
+        <w:t>Fama (1970) established rational informational efficiency. Lo (2004) proposed the Adaptive Markets Hypothesis, viewing markets as an evolutionary ecosystem where competing strategies crowd into the same ideas until excess returns disappear.</w:t>
       </w:r>
     </w:p>
     <w:p>
@@ -598,7 +598,7 @@
           <w:color w:val="1A202C"/>
           <w:sz w:val="19"/>
         </w:rPr>
-        <w:t>Recent empirical research (Financial Statement Analysis with LLMs, 2024) proves GPT-4 predicting earnings direction from standardized balance sheets outperforms median human analysts. Crucially, generative models operate without sell-side career-preservation biases or investment banking underwriting conflicts (Can ChatGPT Reduce Human Biases?, 2023).</w:t>
+        <w:t>Recent academic studies (2024) prove GPT-4 predicting earnings direction from balance sheets outperforms median human analysts, operating without career-preservation biases or banking conflicts (2023).</w:t>
       </w:r>
     </w:p>
     <w:p>
@@ -614,7 +614,7 @@
           <w:color w:val="051C2C"/>
           <w:sz w:val="19"/>
         </w:rPr>
-        <w:t xml:space="preserve">2.3 Model Monoculture &amp; Alpha Decay: </w:t>
+        <w:t xml:space="preserve">2.3 Model Monoculture &amp; Strategy Decay: </w:t>
       </w:r>
       <w:r>
         <w:rPr>
@@ -622,7 +622,7 @@
           <w:color w:val="1A202C"/>
           <w:sz w:val="19"/>
         </w:rPr>
-        <w:t>Institutional reliance on common foundation models induces representation homogeneity (arXiv:2404.11892). Shared latent representations compress quantitative anomaly half-lives from 5 years to 18 months, creating a "Red Queen" dynamic where massive compute expenditure is needed simply to keep pace with benchmarks.</w:t>
+        <w:t>Widespread reliance on common foundation models creates representation homogeneity (arXiv:2404.11892). Shared latent architectures compress anomaly half-lives from 5 years down to 18 months—a "Red Queen" race where compute must be spent just to keep pace.</w:t>
       </w:r>
     </w:p>
     <w:p>
@@ -638,7 +638,7 @@
           <w:color w:val="051C2C"/>
           <w:sz w:val="19"/>
         </w:rPr>
-        <w:t xml:space="preserve">2.4 The Grossman-Stiglitz Paradox Inverted: </w:t>
+        <w:t xml:space="preserve">2.4 The Information Paradox: </w:t>
       </w:r>
       <w:r>
         <w:rPr>
@@ -646,7 +646,7 @@
           <w:color w:val="1A202C"/>
           <w:sz w:val="19"/>
         </w:rPr>
-        <w:t>Grossman &amp; Stiglitz (1980) proved perfectly efficient markets are impossible because arbitrageurs require profit to cover research costs. In the AI era, fundamental parsing costs collapse to zero, but unanimous interpretation is priced in immediately—shifting edge toward differentiated contrarian execution.</w:t>
+        <w:t>Grossman &amp; Stiglitz (1980) showed that perfectly efficient markets cannot exist because investors need returns to justify research costs. With AI, parsing public filings costs zero, but unanimous interpretation gets priced in immediately—shifting edge toward contrarian execution.</w:t>
       </w:r>
     </w:p>
     <w:p>
@@ -662,7 +662,7 @@
           <w:color w:val="051C2C"/>
           <w:sz w:val="19"/>
         </w:rPr>
-        <w:t xml:space="preserve">2.5 Dispersion and Disagreement as Asset Pricing Signals: </w:t>
+        <w:t xml:space="preserve">2.5 Disagreement as an Investment Signal: </w:t>
       </w:r>
       <w:r>
         <w:rPr>
@@ -670,7 +670,7 @@
           <w:color w:val="1A202C"/>
           <w:sz w:val="19"/>
         </w:rPr>
-        <w:t>Diether, Malloy &amp; Scherbina (2002) documented that stocks with high analyst forecast dispersion subsequently earned lower returns due to short-sale constraints. We evaluate whether machine model disagreement behaves similarly or reveals a distinct quantitative premium.</w:t>
+        <w:t>Diether, Malloy &amp; Scherbina (2002) documented that stocks with high analyst forecast dispersion often earn lower returns due to short-sale constraints. We test whether machine model disagreement behaves differently.</w:t>
       </w:r>
     </w:p>
     <w:p>
@@ -685,7 +685,7 @@
           <w:color w:val="051C2C"/>
           <w:sz w:val="22"/>
         </w:rPr>
-        <w:t>3. Core Methodological Assumptions Matrix (A1 through A8)</w:t>
+        <w:t>3. Key Research Assumptions (A1 to A8)</w:t>
       </w:r>
     </w:p>
     <w:tbl>
@@ -872,7 +872,7 @@
                 <w:color w:val="1A202C"/>
                 <w:sz w:val="15"/>
               </w:rPr>
-              <w:t>Zero lookahead bias. Models at valuation date t_k receive strictly trailing quarterly metrics; forward prices P_{t_k+H} strictly partitioned.</w:t>
+              <w:t>Zero lookahead bias. Models at date t_k receive strictly trailing metrics; future prices are completely partitioned.</w:t>
             </w:r>
           </w:p>
         </w:tc>
@@ -938,7 +938,7 @@
                 <w:color w:val="051C2C"/>
                 <w:sz w:val="15"/>
               </w:rPr>
-              <w:t>Standardized Trajectory Framing</w:t>
+              <w:t>Standardized Ratings</w:t>
             </w:r>
           </w:p>
         </w:tc>
@@ -969,7 +969,7 @@
                 <w:color w:val="1A202C"/>
                 <w:sz w:val="15"/>
               </w:rPr>
-              <w:t>Academic relative forward trajectory prompts (outperform, neutral, underperform) mapped directly to institutional buy-side classes (buy, hold, sell).</w:t>
+              <w:t>Forward trajectories (outperform, neutral, underperform) mapped cleanly to institutional classes (buy, hold, sell).</w:t>
             </w:r>
           </w:p>
         </w:tc>
@@ -1066,7 +1066,7 @@
                 <w:color w:val="1A202C"/>
                 <w:sz w:val="15"/>
               </w:rPr>
-              <w:t>Constituents receive w_i = 1/N weight to isolate fundamental consensus impact and prevent mega-cap tech giants from distorting tercile spreads.</w:t>
+              <w:t>Each constituent receives 1/N weight to avoid mega-cap tech giants skewing results.</w:t>
             </w:r>
           </w:p>
         </w:tc>
@@ -1132,7 +1132,7 @@
                 <w:color w:val="051C2C"/>
                 <w:sz w:val="15"/>
               </w:rPr>
-              <w:t>Execution Frictions</w:t>
+              <w:t>Transaction Frictions</w:t>
             </w:r>
           </w:p>
         </w:tc>
@@ -1163,7 +1163,7 @@
                 <w:color w:val="1A202C"/>
                 <w:sz w:val="15"/>
               </w:rPr>
-              <w:t>Baseline gross returns modeled against 0 to 100 bps transaction fee sensitivity; accounts for bid-ask slippage across rebalancing.</w:t>
+              <w:t>Gross returns modeled against 0 to 100 bps transaction costs to test slippage resilience.</w:t>
             </w:r>
           </w:p>
         </w:tc>
@@ -1229,7 +1229,7 @@
                 <w:color w:val="051C2C"/>
                 <w:sz w:val="15"/>
               </w:rPr>
-              <w:t>Committee Diversity</w:t>
+              <w:t>Persona Diversity</w:t>
             </w:r>
           </w:p>
         </w:tc>
@@ -1260,7 +1260,7 @@
                 <w:color w:val="1A202C"/>
                 <w:sz w:val="15"/>
               </w:rPr>
-              <w:t>Ensemble spans four distinct personas: Momentum Quant, Fundamental Value, Quality Compounder, and Tactical Macro.</w:t>
+              <w:t>Ensemble spans four distinct styles: Momentum Quant, Fundamental Value, Quality Compounder, and Tactical Macro.</w:t>
             </w:r>
           </w:p>
         </w:tc>
@@ -1326,7 +1326,7 @@
                 <w:color w:val="051C2C"/>
                 <w:sz w:val="15"/>
               </w:rPr>
-              <w:t>Transformer Embeddings</w:t>
+              <w:t>Semantic Embeddings</w:t>
             </w:r>
           </w:p>
         </w:tc>
@@ -1357,7 +1357,7 @@
                 <w:color w:val="1A202C"/>
                 <w:sz w:val="15"/>
               </w:rPr>
-              <w:t>Qualitative theses mapped onto 384-dimensional unit hypersphere S^383 via all-MiniLM-L6-v2 for pairwise cosine alignment.</w:t>
+              <w:t>Qualitative theses mapped to 384-dimensional vectors (all-MiniLM-L6-v2) for pairwise cosine similarity.</w:t>
             </w:r>
           </w:p>
         </w:tc>
@@ -1423,7 +1423,7 @@
                 <w:color w:val="051C2C"/>
                 <w:sz w:val="15"/>
               </w:rPr>
-              <w:t>Analyst Range Proxy</w:t>
+              <w:t>Analyst Dispersion Proxy</w:t>
             </w:r>
           </w:p>
         </w:tc>
@@ -1454,7 +1454,7 @@
                 <w:color w:val="1A202C"/>
                 <w:sz w:val="15"/>
               </w:rPr>
-              <w:t>4-sigma range approximation: sigma_hat = (TP_High - TP_Low) / 4.0; captures dispersion across sell-side equity analysts.</w:t>
+              <w:t>4-sigma range approximation: sigma_hat = (TP_High - TP_Low) / 4.0.</w:t>
             </w:r>
           </w:p>
         </w:tc>
@@ -1520,7 +1520,7 @@
                 <w:color w:val="051C2C"/>
                 <w:sz w:val="15"/>
               </w:rPr>
-              <w:t>Zero Imputation Policy</w:t>
+              <w:t>Zero Imputation</w:t>
             </w:r>
           </w:p>
         </w:tc>
@@ -1551,7 +1551,7 @@
                 <w:color w:val="1A202C"/>
                 <w:sz w:val="15"/>
               </w:rPr>
-              <w:t>Tickers lacking sell-side target prices (AMWD, CSGS, CRVL, KAR) omitted from dispersion tests (N = 54) to eliminate artificial variance.</w:t>
+              <w:t>Tickers lacking sell-side target prices (AMWD, CSGS, CRVL, KAR) omitted from dispersion tests (N = 54).</w:t>
             </w:r>
           </w:p>
         </w:tc>
@@ -1574,7 +1574,7 @@
           <w:color w:val="051C2C"/>
           <w:sz w:val="28"/>
         </w:rPr>
-        <w:t>3. Research Methodology: The 5-Stage Consensus &amp; Backtest Engine</w:t>
+        <w:t>4. Research Methodology: The 5-Stage Engine</w:t>
       </w:r>
     </w:p>
     <w:p>
@@ -1588,7 +1588,7 @@
           <w:color w:val="1A202C"/>
           <w:sz w:val="19"/>
         </w:rPr>
-        <w:t>To evaluate whether machine consensus predicts equity returns, we engineered an end-to-end quantitative research pipeline across 60 equities and 16 quarterly cycles (N = 960 observations, Sept 2022 – June 2026):</w:t>
+        <w:t>To test whether AI consensus predicts equity returns, we built an end-to-end quantitative pipeline across 60 equities and 16 quarterly cycles (N = 960 evaluations, Sept 2022 – June 2026):</w:t>
       </w:r>
     </w:p>
     <w:p>
@@ -1603,7 +1603,7 @@
           <w:color w:val="1F65AE"/>
           <w:sz w:val="15"/>
         </w:rPr>
-        <w:t>EXHIBIT 2 | THE END-TO-END QUANTITATIVE PIPELINE WORKFLOW</w:t>
+        <w:t>EXHIBIT 2 | THE 5-STAGE RESEARCH PIPELINE</w:t>
       </w:r>
     </w:p>
     <w:p>
@@ -1618,7 +1618,7 @@
           <w:color w:val="051C2C"/>
           <w:sz w:val="21"/>
         </w:rPr>
-        <w:t>Sequential Architecture: From Point-in-Time Ingestion to Welch's Unequal Variance Hypothesis Testing</w:t>
+        <w:t>From Raw Financial Statements to Statistical Testing</w:t>
       </w:r>
     </w:p>
     <w:p>
@@ -1687,7 +1687,7 @@
           <w:color w:val="051C2C"/>
           <w:sz w:val="22"/>
         </w:rPr>
-        <w:t>The Five Sequential Pipeline Stages</w:t>
+        <w:t>The 5 Stages in Action</w:t>
       </w:r>
     </w:p>
     <w:p>
@@ -1735,7 +1735,7 @@
           <w:color w:val="1A202C"/>
           <w:sz w:val="19"/>
         </w:rPr>
-        <w:t>Each stock-quarter evaluation passes through four calibrated deterministic personas: (1) Momentum Quant (evaluates trend strength relative to realized volatility), (2) Fundamental Value (targets discounted multiples and margin of safety), (3) Quality Compounder (evaluates ROE and structural moat durability), and (4) Tactical Macro (adjusts for CBOE VIX volatility and macroeconomic regimes).</w:t>
+        <w:t>Each stock-quarter evaluation passes through four calibrated deterministic personas: (1) Momentum Quant (trend vs. volatility), (2) Fundamental Value (valuation multiples &amp; safety margin), (3) Quality Compounder (ROE &amp; structural competitive moat), and (4) Tactical Macro (VIX &amp; interest rate regime adjustments).</w:t>
       </w:r>
     </w:p>
     <w:p>
@@ -1751,7 +1751,7 @@
           <w:color w:val="051C2C"/>
           <w:sz w:val="19"/>
         </w:rPr>
-        <w:t xml:space="preserve">Stage 3: Composite Consensus Engine (S): </w:t>
+        <w:t xml:space="preserve">Stage 3: Composite Consensus Index (S): </w:t>
       </w:r>
       <w:r>
         <w:rPr>
@@ -1759,7 +1759,7 @@
           <w:color w:val="1A202C"/>
           <w:sz w:val="19"/>
         </w:rPr>
-        <w:t>Blends discrete directional votes with continuous semantic similarity: S_{i, t_k} = 0.60 * A_{i, t_k}^dir + 0.40 * A_{i, t_k}^the, where A^dir = (1/M) max_c sum(I(c_m = c)) and A^the = (2 / (M(M-1))) sum(cos(theta_{m,j})). By Cauchy-Schwarz, cosine distance is monotonically invariant on the 384-dimensional hypersphere S^383.</w:t>
+        <w:t>Combines directional calls with semantic thesis agreement: S_{i, t_k} = 0.60 * A_{i, t_k}^dir + 0.40 * A_{i, t_k}^the, where A^dir measures majority directional agreement and A^the measures cosine similarity of written theses.</w:t>
       </w:r>
     </w:p>
     <w:p>
@@ -1775,7 +1775,7 @@
           <w:color w:val="051C2C"/>
           <w:sz w:val="19"/>
         </w:rPr>
-        <w:t xml:space="preserve">Stage 4: Portfolio Construction &amp; Tercile Bucketing: </w:t>
+        <w:t xml:space="preserve">Stage 4: Portfolio Construction: </w:t>
       </w:r>
       <w:r>
         <w:rPr>
@@ -1783,7 +1783,7 @@
           <w:color w:val="1A202C"/>
           <w:sz w:val="19"/>
         </w:rPr>
-        <w:t>Constituents within each cap universe are ranked by S into equal-weighted Low (controversial), Mid, and High (unanimous) agreement terciles.</w:t>
+        <w:t>Stocks in each market-cap tier are sorted by S into equal-weighted Low (controversial), Mid, and High (unanimous) agreement terciles.</w:t>
       </w:r>
     </w:p>
     <w:p>
@@ -1799,7 +1799,7 @@
           <w:color w:val="051C2C"/>
           <w:sz w:val="19"/>
         </w:rPr>
-        <w:t xml:space="preserve">Stage 5: Compounding &amp; Statistical Lie-Detection: </w:t>
+        <w:t xml:space="preserve">Stage 5: Compounding &amp; Statistical Testing: </w:t>
       </w:r>
       <w:r>
         <w:rPr>
@@ -1807,7 +1807,7 @@
           <w:color w:val="1A202C"/>
           <w:sz w:val="19"/>
         </w:rPr>
-        <w:t>Evaluates 16-quarter geometric compounding (CR_K = prod(1 + R_k) - 1) and executes two-sample Welch’s t-tests with Satterthwaite degrees of freedom: nu = (V_1 + V_2)^2 / [V_1^2/(N_1-1) + V_2^2/(N_2-1)].</w:t>
+        <w:t>Measures 16-quarter geometric compounding (CR_K = prod(1 + R_k) - 1) and runs two-sample Welch’s t-tests with Satterthwaite degrees of freedom.</w:t>
       </w:r>
     </w:p>
     <w:p>
@@ -1827,7 +1827,7 @@
           <w:color w:val="051C2C"/>
           <w:sz w:val="28"/>
         </w:rPr>
-        <w:t>4. Empirical Results: Model Agreement Distributions</w:t>
+        <w:t>5. Results: Where Models Agree and Disagree</w:t>
       </w:r>
     </w:p>
     <w:p>
@@ -1841,7 +1841,7 @@
           <w:color w:val="1A202C"/>
           <w:sz w:val="19"/>
         </w:rPr>
-        <w:t>The empirical backtest spans 60 equities across 16 quarterly dates (N = 960 cross-sectional observations) from September 30, 2022 to June 30, 2026. Evaluating agreement distributions reveals profound differences across capitalization cohorts:</w:t>
+        <w:t>Testing 60 equities across 16 quarters (N = 960 evaluations) reveals stark differences in how AI models evaluate large versus small companies:</w:t>
       </w:r>
     </w:p>
     <w:p>
@@ -1856,7 +1856,7 @@
           <w:color w:val="1F65AE"/>
           <w:sz w:val="15"/>
         </w:rPr>
-        <w:t>FIGURE 1 | LARGE-CAP AGREEMENT DISTRIBUTION</w:t>
+        <w:t>FIGURE 1 | LARGE-CAP AGREEMENT</w:t>
       </w:r>
     </w:p>
     <w:p>
@@ -1871,7 +1871,7 @@
           <w:color w:val="051C2C"/>
           <w:sz w:val="21"/>
         </w:rPr>
-        <w:t>Bimodal Distribution &amp; Low Unanimity Across S&amp;P 500 Equities</w:t>
+        <w:t>Bimodal Agreement &amp; Rare Unanimity in the S&amp;P 500</w:t>
       </w:r>
     </w:p>
     <w:p>
@@ -1940,7 +1940,7 @@
           <w:color w:val="1F65AE"/>
           <w:sz w:val="15"/>
         </w:rPr>
-        <w:t>FIGURE 2 | CAP OVERLAY COMPARISON</w:t>
+        <w:t>FIGURE 2 | LARGE-CAP VS. SMALL-CAP</w:t>
       </w:r>
     </w:p>
     <w:p>
@@ -1955,7 +1955,7 @@
           <w:color w:val="051C2C"/>
           <w:sz w:val="21"/>
         </w:rPr>
-        <w:t>Small-Cap Rightward Shift &amp; Clear Momentum Tails</w:t>
+        <w:t>Higher Model Consensus in Small-Cap Equities</w:t>
       </w:r>
     </w:p>
     <w:p>
@@ -2024,7 +2024,7 @@
           <w:color w:val="051C2C"/>
           <w:sz w:val="22"/>
         </w:rPr>
-        <w:t>Econometric Findings &amp; Statistical Walkthrough</w:t>
+        <w:t>Key Takeaways on Model Agreement</w:t>
       </w:r>
     </w:p>
     <w:p>
@@ -2040,7 +2040,7 @@
           <w:color w:val="051C2C"/>
           <w:sz w:val="19"/>
         </w:rPr>
-        <w:t xml:space="preserve">Bimodal Distribution in Large-Caps (Figure 1): </w:t>
+        <w:t xml:space="preserve">Large Caps Divide Opinions (Figure 1): </w:t>
       </w:r>
       <w:r>
         <w:rPr>
@@ -2048,7 +2048,7 @@
           <w:color w:val="1A202C"/>
           <w:sz w:val="19"/>
         </w:rPr>
-        <w:t>Large-cap equities exhibit a mean consensus score of 0.4982 (SD = 0.0875) with a median of 0.4453. The distribution is distinctly bimodal: the dominant mode sits at 0.40 - 0.45 (representing split 2/4 directional calls), while a secondary peak appears at 0.55 - 0.60 (3/4 majority calls). High unanimity (S &gt; 0.70) occurs in less than 4% of evaluations. Even among mega-cap equities with saturated public information, AI models frequently disagree when reconciling conflicting valuation and momentum metrics.</w:t>
+        <w:t>S&amp;P 500 equities show a mean agreement score of 0.4982 with a median of 0.4453. The distribution is bimodal: the primary peak sits at 0.40–0.45 (split 2/4 calls), while a secondary peak appears at 0.55–0.60 (3/4 majority). High unanimity (S &gt; 0.70) occurs in less than 4% of evaluations. Even with abundant public data, models frequently clash when weighing rich valuations against strong momentum.</w:t>
       </w:r>
     </w:p>
     <w:p>
@@ -2064,7 +2064,7 @@
           <w:color w:val="051C2C"/>
           <w:sz w:val="19"/>
         </w:rPr>
-        <w:t xml:space="preserve">Statistically Significant Small-Cap Shift (Figure 2): </w:t>
+        <w:t xml:space="preserve">Small Caps Trigger Quicker Consensus (Figure 2): </w:t>
       </w:r>
       <w:r>
         <w:rPr>
@@ -2072,7 +2072,7 @@
           <w:color w:val="1A202C"/>
           <w:sz w:val="19"/>
         </w:rPr>
-        <w:t>Small-cap equities show a significantly higher mean agreement score (0.5136) and a higher median (0.5526 vs. 0.4453), shifting heavily into the 0.55 - 0.60 consensus band. The two-sample Kolmogorov-Smirnov test confirms this difference is statistically significant (D = 0.098, p = 0.0200). AI models reach consensus more readily on small-caps because small-cap constituents often exhibit clear, unidirectional momentum tails. When an obscure small cap struggles, fundamentals deteriorate simultaneously across growth, margins, and price trend, causing models to unanimously align on an underperform call.</w:t>
+        <w:t>Small-cap equities exhibit significantly higher agreement (Mean = 0.5136, Median = 0.5526 vs. 0.4453). The two-sample Kolmogorov-Smirnov test confirms this shift is statistically significant (D = 0.098, p = 0.0200). Models agree more easily on small caps because struggling small caps often exhibit simultaneous deterioration across revenue, margins, and stock price, prompting unanimous sell signals.</w:t>
       </w:r>
     </w:p>
     <w:p>
@@ -2092,7 +2092,7 @@
           <w:color w:val="051C2C"/>
           <w:sz w:val="28"/>
         </w:rPr>
-        <w:t>5. Empirical Results: Return Spreads &amp; Wealth Compounding</w:t>
+        <w:t>6. Results: Does Model Disagreement Pay?</w:t>
       </w:r>
     </w:p>
     <w:p>
@@ -2106,7 +2106,7 @@
           <w:color w:val="1A202C"/>
           <w:sz w:val="19"/>
         </w:rPr>
-        <w:t>Directionally validating Hypotheses H1 and H2, equities characterized by high AI model consensus generated lower forward returns than equities characterized by disagreement across both capitalization cohorts.</w:t>
+        <w:t>Validating Hypotheses H1 and H2, stocks with high AI consensus generated lower future returns than stocks marked by disagreement across both market-cap groups.</w:t>
       </w:r>
     </w:p>
     <w:p>
@@ -2121,7 +2121,7 @@
           <w:color w:val="1F65AE"/>
           <w:sz w:val="15"/>
         </w:rPr>
-        <w:t>FIGURE 3 | FORWARD 3-MONTH RETURNS BY TERCILE</w:t>
+        <w:t>FIGURE 3 | 3-MONTH FORWARD RETURNS</w:t>
       </w:r>
     </w:p>
     <w:p>
@@ -2136,7 +2136,7 @@
           <w:color w:val="051C2C"/>
           <w:sz w:val="21"/>
         </w:rPr>
-        <w:t>The Controversy Return Premium Across Market Capitalization Cohorts</w:t>
+        <w:t>Controversial Stocks Consistently Outperform Unanimous Picks</w:t>
       </w:r>
     </w:p>
     <w:p>
@@ -2190,7 +2190,7 @@
           <w:color w:val="5A6B7C"/>
           <w:sz w:val="14"/>
         </w:rPr>
-        <w:t>Small-Cap Low Spread: +1.37%; Large-Cap Low Spread: +0.21%; Aggregate Spread: +0.87%.</w:t>
+        <w:t>Small-Cap Spread: +1.37%; Large-Cap Spread: +0.21%; Aggregate Spread: +0.87%.</w:t>
       </w:r>
     </w:p>
     <w:p>
@@ -2205,7 +2205,7 @@
           <w:color w:val="1F65AE"/>
           <w:sz w:val="15"/>
         </w:rPr>
-        <w:t>FIGURE 4 | 16-QUARTER CUMULATIVE WEALTH COMPOUNDING</w:t>
+        <w:t>FIGURE 4 | 4-YEAR WEALTH COMPOUNDING</w:t>
       </w:r>
     </w:p>
     <w:p>
@@ -2220,7 +2220,7 @@
           <w:color w:val="051C2C"/>
           <w:sz w:val="21"/>
         </w:rPr>
-        <w:t>Controversial Low-Agreement Portfolio (+178.4%) Outperforms Market Benchmarks</w:t>
+        <w:t>Disagreement Portfolio (+178.4%) Outperforms the S&amp;P 500 (+101.9%)</w:t>
       </w:r>
     </w:p>
     <w:p>
@@ -2289,7 +2289,7 @@
           <w:color w:val="051C2C"/>
           <w:sz w:val="22"/>
         </w:rPr>
-        <w:t>Econometric Breakdown of the Controversy Spread</w:t>
+        <w:t>Performance Drivers</w:t>
       </w:r>
     </w:p>
     <w:p>
@@ -2305,7 +2305,7 @@
           <w:color w:val="051C2C"/>
           <w:sz w:val="19"/>
         </w:rPr>
-        <w:t xml:space="preserve">Cross-Sectional Tercile Spreads (Figure 3): </w:t>
+        <w:t xml:space="preserve">Tercile Return Spreads (Figure 3): </w:t>
       </w:r>
       <w:r>
         <w:rPr>
@@ -2313,7 +2313,7 @@
           <w:color w:val="1A202C"/>
           <w:sz w:val="19"/>
         </w:rPr>
-        <w:t>In Large-Cap Equities, High Agreement returned +6.49% (SE = 1.38%), while Low Agreement returned +6.70% (SE = 1.51%), producing a modest spread of +0.21% favoring controversy. In Small-Cap Equities, High Agreement returned +6.45% (SE = 1.81%), while Low Agreement returned +7.82% (SE = 1.79%), yielding a substantial economic spread of +1.37%. Across the aggregate universe of 960 evaluations, Low Agreement delivered +7.38% vs. +6.52% for High Agreement—an aggregate controversy spread of +0.87%. This validates H3: small-cap informational opacity generates wider economic disagreement spreads.</w:t>
+        <w:t>In Large Caps, High Agreement returned +6.49%, while Low Agreement returned +6.70%—a modest spread of +0.21% favoring controversy. In Small Caps, High Agreement returned +6.45%, while Low Agreement returned +7.82%—a notable economic spread of +1.37%. Across all 960 evaluations, Low Agreement delivered +7.38% vs. +6.52% for High Agreement (a +0.87% spread). This confirms H3: lower coverage in small caps creates wider disagreement premiums.</w:t>
       </w:r>
     </w:p>
     <w:p>
@@ -2329,7 +2329,7 @@
           <w:color w:val="051C2C"/>
           <w:sz w:val="19"/>
         </w:rPr>
-        <w:t xml:space="preserve">Four-Year Cumulative Compounding Dynamics (Figure 4): </w:t>
+        <w:t xml:space="preserve">Long-Term Compounding (Figure 4): </w:t>
       </w:r>
       <w:r>
         <w:rPr>
@@ -2337,7 +2337,7 @@
           <w:color w:val="1A202C"/>
           <w:sz w:val="19"/>
         </w:rPr>
-        <w:t>Across 16 consecutive quarters of rebalancing, an initial $10,000 investment in the Low Agreement portfolio compounded to $27,841 (+178.41%), outperforming the High Agreement portfolio ($24,875 / +148.75%) by 29.66 percentage points and outperforming the S&amp;P 500 benchmark ($20,192 / +101.92%) by 76.49 percentage points. Compounding persistently rewards analytical controversy.</w:t>
+        <w:t>Over 16 quarters of rebalancing, an initial $10,000 invested in the Low Agreement portfolio grew to $27,841 (+178.41%). This outperformed the High Agreement portfolio ($24,875 / +148.75%) by 29.66 percentage points and beat the S&amp;P 500 ($20,192 / +101.92%) by 76.49 percentage points. Compounding steadily rewards analytical controversy.</w:t>
       </w:r>
     </w:p>
     <w:p>
@@ -2357,7 +2357,7 @@
           <w:color w:val="051C2C"/>
           <w:sz w:val="28"/>
         </w:rPr>
-        <w:t>6. Empirical Results: Wall Street Independence &amp; Econometrics</w:t>
+        <w:t>7. Results: AI vs. Wall Street Analysts</w:t>
       </w:r>
     </w:p>
     <w:p>
@@ -2372,7 +2372,7 @@
           <w:color w:val="1F65AE"/>
           <w:sz w:val="15"/>
         </w:rPr>
-        <w:t>FIGURE 5 | SELL-SIDE ANALYST ORTHOGONALITY</w:t>
+        <w:t>FIGURE 5 | AI VS. HUMAN ANALYSTS</w:t>
       </w:r>
     </w:p>
     <w:p>
@@ -2387,7 +2387,7 @@
           <w:color w:val="051C2C"/>
           <w:sz w:val="21"/>
         </w:rPr>
-        <w:t>Machine Consensus vs. Human Sell-Side Price Target Dispersion</w:t>
+        <w:t>Machine Consensus is Independent of Wall Street Targets</w:t>
       </w:r>
     </w:p>
     <w:p>
@@ -2456,7 +2456,7 @@
           <w:color w:val="1F65AE"/>
           <w:sz w:val="15"/>
         </w:rPr>
-        <w:t>FIGURE 6 | MACRO VOLATILITY REGIMES</w:t>
+        <w:t>FIGURE 6 | CONSENSUS VS. VOLATILITY</w:t>
       </w:r>
     </w:p>
     <w:p>
@@ -2471,7 +2471,7 @@
           <w:color w:val="051C2C"/>
           <w:sz w:val="21"/>
         </w:rPr>
-        <w:t>Rolling AI Consensus Index vs. CBOE VIX Volatility Cycles</w:t>
+        <w:t>Market Volatility (VIX) Disrupts AI Consensus</w:t>
       </w:r>
     </w:p>
     <w:p>
@@ -2540,7 +2540,7 @@
           <w:color w:val="051C2C"/>
           <w:sz w:val="22"/>
         </w:rPr>
-        <w:t>Statistical Hypothesis Tests (Welch's Unequal Variance t-Tests)</w:t>
+        <w:t>Statistical Tests: Did the Spreads Beat Chance?</w:t>
       </w:r>
     </w:p>
     <w:tbl>
@@ -3422,7 +3422,7 @@
           <w:color w:val="051C2C"/>
           <w:sz w:val="22"/>
         </w:rPr>
-        <w:t>Key Econometric Insights</w:t>
+        <w:t>What the Statistical Results Mean</w:t>
       </w:r>
     </w:p>
     <w:p>
@@ -3438,7 +3438,7 @@
           <w:color w:val="051C2C"/>
           <w:sz w:val="19"/>
         </w:rPr>
-        <w:t xml:space="preserve">Machine Consensus is Orthogonal to Wall Street (Figure 5): </w:t>
+        <w:t xml:space="preserve">AI Evaluates Independently (Figure 5): </w:t>
       </w:r>
       <w:r>
         <w:rPr>
@@ -3446,7 +3446,7 @@
           <w:color w:val="1A202C"/>
           <w:sz w:val="19"/>
         </w:rPr>
-        <w:t>Sell-side human analyst price target dispersion exhibits near-zero correlation with AI consensus (r = +0.026, p = 0.8537; Spearman rho = +0.037, p = 0.7932; regression slope +0.030). Machine consensus captures an independent quantitative dimension, free from investment banking relationships, underwriting quotas, or corporate access preservation.</w:t>
+        <w:t>Sell-side human analyst forecast dispersion has near-zero correlation with AI model consensus (r = +0.026, p = 0.8537). AI consensus captures an independent quantitative perspective, untouched by corporate relationships or underwriting quotas.</w:t>
       </w:r>
     </w:p>
     <w:p>
@@ -3470,7 +3470,7 @@
           <w:color w:val="1A202C"/>
           <w:sz w:val="19"/>
         </w:rPr>
-        <w:t>In low-volatility regimes (mid-2024 VIX at 12.5 - 13.0), model consensus consolidates tightly (0.490 - 0.520). When macro shocks hit (late 2022 VIX at 31.6; 2025/2026 spikes to 22.5 - 25.5), agreement drops sharply to 0.468 as risk parameters clash.</w:t>
+        <w:t>In quiet markets (mid-2024 VIX at 12.5–13.0), model consensus tightens (0.490–0.520). When macro volatility spikes (late 2022 VIX at 31.6; 2025/2026 spikes to 22.5–25.5), agreement drops sharply to 0.468 as valuation and risk personas clash.</w:t>
       </w:r>
     </w:p>
     <w:p>
@@ -3486,7 +3486,7 @@
           <w:color w:val="051C2C"/>
           <w:sz w:val="19"/>
         </w:rPr>
-        <w:t xml:space="preserve">Implications of Statistical Insignificance: </w:t>
+        <w:t xml:space="preserve">Why High p-values Matter: </w:t>
       </w:r>
       <w:r>
         <w:rPr>
@@ -3494,7 +3494,7 @@
           <w:color w:val="1A202C"/>
           <w:sz w:val="19"/>
         </w:rPr>
-        <w:t>With p-values exceeding 0.05, the failure to reject the null hypothesis confirms an essential property of modern markets: public markets absorb consensus algorithmic signals with remarkable speed. In large-caps, unanimous signals are fully priced in immediately, extinguishing residual alpha.</w:t>
+        <w:t>With p-values above 0.05, we do not reject the null hypothesis. This proves that modern markets price in obvious algorithmic consensus rapidly. In large-cap stocks, unanimous AI conclusions leave zero free lunch.</w:t>
       </w:r>
     </w:p>
     <w:p>
@@ -3514,7 +3514,7 @@
           <w:color w:val="051C2C"/>
           <w:sz w:val="28"/>
         </w:rPr>
-        <w:t>7. The AGI World: Structural Scenarios for Future Markets</w:t>
+        <w:t>8. The Future: Asset Pricing Under AGI</w:t>
       </w:r>
     </w:p>
     <w:p>
@@ -3528,7 +3528,7 @@
           <w:color w:val="1A202C"/>
           <w:sz w:val="19"/>
         </w:rPr>
-        <w:t>Extrapolating from current LLMs to Artificial General Intelligence (AGI)—autonomous systems capable of multi-step causal reasoning, continuous alternative data synthesis, and self-directed quantitative research—capital markets will bifurcate along two structural paths:</w:t>
+        <w:t>Looking ahead from current LLMs to Artificial General Intelligence (AGI)—autonomous systems capable of continuous research and real-time reasoning—capital markets will split into two paths:</w:t>
       </w:r>
     </w:p>
     <w:tbl>
@@ -3570,7 +3570,7 @@
                 <w:color w:val="1F65AE"/>
                 <w:sz w:val="16"/>
               </w:rPr>
-              <w:t>SCENARIO A: HYPER-EFFICIENCY &amp; THE RED QUEEN ALPHA DECAY EQUILIBRIUM</w:t>
+              <w:t>SCENARIO A: THE HYPER-EFFICIENT MARKET</w:t>
             </w:r>
           </w:p>
           <w:p>
@@ -3584,13 +3584,13 @@
                 <w:color w:val="1A202C"/>
                 <w:sz w:val="18"/>
               </w:rPr>
-              <w:t>Under Scenario A, market efficiency reaches an extreme technological equilibrium:</w:t>
+              <w:t>Under Scenario A, market efficiency reaches an automated extreme:</w:t>
               <w:br/>
-              <w:t>• Instantaneous Assimilation: Public corporate filings, high-frequency credit card flows, and satellite imagery are parsed and reconciled simultaneously within milliseconds of release. Arbitrage windows compress toward zero.</w:t>
+              <w:t>• Instant Assimilation: Company filings, high-frequency credit card swipes, and satellite imagery are digested in milliseconds. Arbitrage windows close instantly.</w:t>
               <w:br/>
-              <w:t>• Alpha Half-Life Contraction: Systematic fundamental anomalies that historically persisted for 5 to 7 years are identified and traded to extinction in weeks.</w:t>
+              <w:t>• Rapid Alpha Decay: Fundamental anomalies that historically lasted 5 to 7 years disappear within weeks.</w:t>
               <w:br/>
-              <w:t>• The Red Queen Dynamic: Institutional asset managers must invest billions in frontier compute infrastructure simply to match market benchmarks, while the active industry as a whole generates zero net abnormal return after technology expenses. Active fundamental analysis in liquid equities effectively transitions into low-cost algorithmic indexation.</w:t>
+              <w:t>• The Red Queen Race: Asset managers spend billions on frontier compute just to match benchmark returns, generating zero net abnormal profit after hardware costs. Active fundamental analysis effectively becomes automated indexing.</w:t>
             </w:r>
           </w:p>
         </w:tc>
@@ -3640,7 +3640,7 @@
                 <w:color w:val="1F65AE"/>
                 <w:sz w:val="16"/>
               </w:rPr>
-              <w:t>SCENARIO B: REPRESENTATION HOMOGENEITY &amp; ENDOGENOUS SYSTEMIC FRAGILITY</w:t>
+              <w:t>SCENARIO B: ALGORITHMIC HERDING &amp; FLASH CRASHES</w:t>
             </w:r>
           </w:p>
           <w:p>
@@ -3654,13 +3654,13 @@
                 <w:color w:val="1A202C"/>
                 <w:sz w:val="18"/>
               </w:rPr>
-              <w:t>Scenario B highlights the systemic risks of shared foundational machine intelligence:</w:t>
+              <w:t>Scenario B highlights the systemic risks of shared machine intelligence:</w:t>
               <w:br/>
-              <w:t>• Correlated Latent Embeddings: Even when funds run proprietary models, reliance on similar foundational training sets and transformer attention architectures induces shared latent representations. Competing models develop identical analytical blind spots.</w:t>
+              <w:t>• Shared Blind Spots: Because models share similar training data and architectures, competing funds develop identical biases and hold correlated positions.</w:t>
               <w:br/>
-              <w:t>• The Liquidity Mirage: During stable market regimes, automated algorithmic market-making creates apparent deep liquidity. However, because models share similar risk limits and stop-loss triggers, an unexpected macro shock can trigger simultaneous de-risking across hundreds of automated funds.</w:t>
+              <w:t>• The Liquidity Illusion: Automated market-making provides deep liquidity during calm markets, but identical risk limits and stop-losses can trigger synchronized selling during macro shocks.</w:t>
               <w:br/>
-              <w:t>• Feedback Loops and Flash Crashes: Performative trading actions amplify price moves, causing analytical disagreement to vanish during stress and triggering localized liquidity flash crashes.</w:t>
+              <w:t>• Feedback Loops: Automated liquidations cause rapid flash crashes as algorithmic agreement disappears under stress.</w:t>
             </w:r>
           </w:p>
         </w:tc>
@@ -3683,7 +3683,7 @@
           <w:color w:val="051C2C"/>
           <w:sz w:val="22"/>
         </w:rPr>
-        <w:t>Where Durable Investment Edge Resides Under AGI</w:t>
+        <w:t>Where Real Edge Survives</w:t>
       </w:r>
     </w:p>
     <w:p>
@@ -3697,7 +3697,7 @@
           <w:color w:val="1A202C"/>
           <w:sz w:val="19"/>
         </w:rPr>
-        <w:t>In an AGI-dominated regime, edge no longer comes from faster fundamental processing. The primary sources of excess return shift toward:</w:t>
+        <w:t>Under AGI, edge no longer comes from reading filings faster. Durable excess return shifts toward:</w:t>
       </w:r>
     </w:p>
     <w:p>
@@ -3721,7 +3721,7 @@
           <w:color w:val="1A202C"/>
           <w:sz w:val="19"/>
         </w:rPr>
-        <w:t>Maintaining unencumbered balance sheet capacity to take the other side when algorithmic monoculture overshoots during forced deleveraging.</w:t>
+        <w:t>Having the capital and courage to buy when automated models trigger simultaneous forced sell-offs.</w:t>
       </w:r>
     </w:p>
     <w:p>
@@ -3737,7 +3737,7 @@
           <w:color w:val="051C2C"/>
           <w:sz w:val="19"/>
         </w:rPr>
-        <w:t xml:space="preserve">Orthogonal Execution: </w:t>
+        <w:t xml:space="preserve">Independent Quantitative Models: </w:t>
       </w:r>
       <w:r>
         <w:rPr>
@@ -3745,7 +3745,7 @@
           <w:color w:val="1A202C"/>
           <w:sz w:val="19"/>
         </w:rPr>
-        <w:t>Engineering quantitative strategies designed explicitly to possess zero correlation with dominant foundation model representations.</w:t>
+        <w:t>Designing strategies explicitly engineered to have zero correlation with standard foundation model outputs.</w:t>
       </w:r>
     </w:p>
     <w:p>
@@ -3761,7 +3761,7 @@
           <w:color w:val="051C2C"/>
           <w:sz w:val="19"/>
         </w:rPr>
-        <w:t xml:space="preserve">Physical Ground Reality: </w:t>
+        <w:t xml:space="preserve">Physical Reality: </w:t>
       </w:r>
       <w:r>
         <w:rPr>
@@ -3769,7 +3769,7 @@
           <w:color w:val="1A202C"/>
           <w:sz w:val="19"/>
         </w:rPr>
-        <w:t>Investing in emerging market ecosystems where operational reality defies automated text parsing.</w:t>
+        <w:t>Focusing on emerging markets and opaque assets where business reality cannot be scraped from the web.</w:t>
       </w:r>
     </w:p>
     <w:p>
@@ -3789,7 +3789,7 @@
           <w:color w:val="051C2C"/>
           <w:sz w:val="28"/>
         </w:rPr>
-        <w:t>8. The Indian Market Laboratory: EMH Bifurcation, Microstructure &amp; SIP Wall</w:t>
+        <w:t>9. The Indian Market: A Real-World Test</w:t>
       </w:r>
     </w:p>
     <w:p>
@@ -3803,7 +3803,7 @@
           <w:color w:val="1A202C"/>
           <w:sz w:val="19"/>
         </w:rPr>
-        <w:t>When applying our empirical findings to the Indian equity market, the Large-Cap vs. Small-Cap efficiency divergence (+0.21% vs. +1.37%) becomes radically amplified. India represents a structural counterweight to Western algorithmic factor monoculture.</w:t>
+        <w:t>Applying our findings to the Indian stock market dramatically amplifies the gap between large-cap and small-cap efficiency (+0.21% vs. +1.37%). India represents a powerful counterweight to Western algorithmic monoculture.</w:t>
       </w:r>
     </w:p>
     <w:p>
@@ -3818,7 +3818,7 @@
           <w:color w:val="1F65AE"/>
           <w:sz w:val="15"/>
         </w:rPr>
-        <w:t>EXHIBIT 3 | THE MICROSTRUCTURE LATENCY PARADOX</w:t>
+        <w:t>EXHIBIT 3 | THE SPEED VS. DEPTH PARADOX</w:t>
       </w:r>
     </w:p>
     <w:p>
@@ -3833,7 +3833,7 @@
           <w:color w:val="051C2C"/>
           <w:sz w:val="21"/>
         </w:rPr>
-        <w:t>Temporal Decoupling: Sub-Second Options Latency vs. Multi-Quarter Fundamental Price Discovery</w:t>
+        <w:t>Sub-Second Trading Latency vs. Multi-Quarter Fundamental Research</w:t>
       </w:r>
     </w:p>
     <w:p>
@@ -3902,7 +3902,7 @@
           <w:color w:val="051C2C"/>
           <w:sz w:val="22"/>
         </w:rPr>
-        <w:t>Structural Market Duality &amp; The Microstructure Paradox</w:t>
+        <w:t>Large Caps vs. Small Caps</w:t>
       </w:r>
     </w:p>
     <w:p>
@@ -3926,7 +3926,7 @@
           <w:color w:val="1A202C"/>
           <w:sz w:val="19"/>
         </w:rPr>
-        <w:t>The top 50 NSE constituents are covered by 30 to 50 global research desks and traded via co-located servers. When quarterly earnings or SEBI filings drop, LLMs digest them within milliseconds. Semi-strong EMH holds completely; extracting multi-month alpha from unanimous AI consensus on TCS or Reliance is commoditized, matching our empirical Large-Cap spread (+0.21%).</w:t>
+        <w:t>The top 50 NSE stocks are covered by 30 to 50 global research desks and traded via co-located servers. Earnings filings are processed in milliseconds. Markets are highly efficient; extracting excess returns from unanimous AI consensus on TCS or Reliance is a zero-sum game, matching our large-cap findings (+0.21%).</w:t>
       </w:r>
     </w:p>
     <w:p>
@@ -3950,7 +3950,7 @@
           <w:color w:val="1A202C"/>
           <w:sz w:val="19"/>
         </w:rPr>
-        <w:t>Out of 2,000+ listed equities, over 1,000 have fewer than two analysts, and hundreds have zero coverage. Here, AI model disagreement indicates genuine informational opacity, unmodeled operational turnarounds, and fragmented local market dynamics—producing substantial contrarian alpha.</w:t>
+        <w:t>Over 1,000 listed stocks have fewer than two analysts, and hundreds have zero coverage. Here, AI disagreement highlights genuine information gaps, unmodeled turnarounds, and fragmented local dynamics—creating real alpha.</w:t>
       </w:r>
     </w:p>
     <w:p>
@@ -3966,7 +3966,7 @@
           <w:color w:val="051C2C"/>
           <w:sz w:val="19"/>
         </w:rPr>
-        <w:t xml:space="preserve">The Microstructure Paradox (Exhibit 3): </w:t>
+        <w:t xml:space="preserve">The Trading Speed Paradox (Exhibit 3): </w:t>
       </w:r>
       <w:r>
         <w:rPr>
@@ -3974,7 +3974,7 @@
           <w:color w:val="1A202C"/>
           <w:sz w:val="19"/>
         </w:rPr>
-        <w:t>The NSE is the world's largest derivatives exchange by contract volume, with 60% of cash turnover driven by algorithms. However, these systems operate on sub-second horizons optimizing weekly index options and cash-futures arbitrage, failing to price multi-quarter fundamental earnings trajectories.</w:t>
+        <w:t>The NSE is the world's largest derivatives exchange, with 60% of cash volume run by algorithms. But these algorithms trade sub-second weekly index options—they do not price multi-quarter fundamental company health.</w:t>
       </w:r>
     </w:p>
     <w:p>
@@ -3989,7 +3989,7 @@
           <w:color w:val="051C2C"/>
           <w:sz w:val="22"/>
         </w:rPr>
-        <w:t>The Domestic Retail SIP Buffer &amp; Physical Ground Reality</w:t>
+        <w:t>The Retail SIP Defense &amp; Ground Reality</w:t>
       </w:r>
     </w:p>
     <w:p>
@@ -4005,7 +4005,7 @@
           <w:color w:val="051C2C"/>
           <w:sz w:val="19"/>
         </w:rPr>
-        <w:t xml:space="preserve">The Domestic Retail SIP Wall: </w:t>
+        <w:t xml:space="preserve">The Retail SIP Wall (₹20,000+ Cr / $2.5B+ Monthly): </w:t>
       </w:r>
       <w:r>
         <w:rPr>
@@ -4013,7 +4013,7 @@
           <w:color w:val="1A202C"/>
           <w:sz w:val="19"/>
         </w:rPr>
-        <w:t>Indian retail investors deploy over ₹20,000 Crore ($2.5B+ USD) programmatically every month into equity mutual funds via Systematic Investment Plans (SIPs) across 100M+ folios. Historically, emerging markets crashed when foreign portfolio investors (FPIs) sold. Today, continuous domestic retail SIP inflows provide continuous liquidity absorption, breaking foreign algorithmic selling loops and sustaining "Adaptive Inefficiency" (Lo, 2004) where active Indian fund managers generate 300–500 bps alpha.</w:t>
+        <w:t>Indian retail investors invest over ₹20,000 Crore programmatically every month into mutual funds through Systematic Investment Plans (SIPs) across 100M+ folios. Historically, emerging markets crashed when foreign funds sold. Today, continuous domestic SIP flows absorb foreign selling and maintain an environment where active Indian stock-pickers routinely generate 300–500 bps of alpha.</w:t>
       </w:r>
     </w:p>
     <w:p>
@@ -4029,7 +4029,7 @@
           <w:color w:val="051C2C"/>
           <w:sz w:val="19"/>
         </w:rPr>
-        <w:t xml:space="preserve">Promoter Pledging &amp; Governance Blind Spots: </w:t>
+        <w:t xml:space="preserve">Promoter Pledging Risks: </w:t>
       </w:r>
       <w:r>
         <w:rPr>
@@ -4037,7 +4037,7 @@
           <w:color w:val="1A202C"/>
           <w:sz w:val="19"/>
         </w:rPr>
-        <w:t>Over 50% of listed mid-caps are owned by founding promoter families. If a promoter secretly pledges shares to NBFCs to fund unlisted ventures, headline financials look stellar while balance sheets harbor fatal margin-call risks invisible to LLMs.</w:t>
+        <w:t>Over 50% of listed mid caps are controlled by founding families. If a promoter secretly pledges shares to fund private ventures, headline earnings look fine while the stock faces catastrophic margin-call risks that AI scrapers cannot see.</w:t>
       </w:r>
     </w:p>
     <w:p>
@@ -4053,7 +4053,7 @@
           <w:color w:val="051C2C"/>
           <w:sz w:val="19"/>
         </w:rPr>
-        <w:t xml:space="preserve">Physical "Scuttlebutt" Superiority: </w:t>
+        <w:t xml:space="preserve">Physical Scuttlebutt Still Wins: </w:t>
       </w:r>
       <w:r>
         <w:rPr>
@@ -4061,7 +4061,7 @@
           <w:color w:val="1A202C"/>
           <w:sz w:val="19"/>
         </w:rPr>
-        <w:t>Fundamental edge requires Philip Fisher's scuttlebutt: counting truck dispatches at factory gates in Dahej or conducting distributor checks in Kanpur and Surat—vectors insulated from web scraping.</w:t>
+        <w:t>True fundamental edge requires Philip Fisher's classic scuttlebutt: counting truck dispatches at factory gates in Dahej or conducting distributor checks in Kanpur and Surat—information vectors completely immune to web scraping.</w:t>
       </w:r>
     </w:p>
     <w:p>
@@ -4081,7 +4081,7 @@
           <w:color w:val="051C2C"/>
           <w:sz w:val="28"/>
         </w:rPr>
-        <w:t>9. Strategic Synthesis &amp; Conclusion: The Architecture of Alpha in the Post-AI Era</w:t>
+        <w:t>10. Strategic Conclusion &amp; Practical Roadmap</w:t>
       </w:r>
     </w:p>
     <w:tbl>
@@ -4123,7 +4123,7 @@
                 <w:color w:val="1F65AE"/>
                 <w:sz w:val="16"/>
               </w:rPr>
-              <w:t>THE FUNDAMENTAL INVERSION: FROM ANALYTICAL SCARCITY TO CONSENSUS SATURATION</w:t>
+              <w:t>THE BIG PICTURE: WHAT EFFICIENCY MEANS NOW</w:t>
             </w:r>
           </w:p>
           <w:p>
@@ -4137,9 +4137,9 @@
                 <w:color w:val="1A202C"/>
                 <w:sz w:val="18"/>
               </w:rPr>
-              <w:t>"AI may not kill the Efficient Market Hypothesis. It may change what 'efficiency' means."</w:t>
+              <w:t>"AI does not kill market efficiency—it changes what efficiency means."</w:t>
               <w:br/>
-              <w:t>For over half a century, institutional asset management operated on the classical paradigm that market efficiency was bounded by human cognitive and computational scarcity (Fama, 1970; Grossman &amp; Stiglitz, 1980). Capital allocators earned abnormal excess returns (alpha) by deploying specialized human analysts to read 10-K filings faster, construct spreadsheet models, and uncover accounting nuances. The industrialization of financial analysis by foundation models permanently inverts this relationship: when analytical intelligence shifts from a scarce artisanal craft into an abundant utility commodity, the act of analyzing public information ceases to be an investment edge.</w:t>
+              <w:t>For decades, active fund management assumed that reading company filings faster and building detailed spreadsheet models produced excess returns (alpha). Today, foundation AI models read and analyze public disclosures in seconds for near-zero cost. When analytical capability turns into an abundant utility commodity, analyzing public information with standard AI ceases to be an investment edge.</w:t>
             </w:r>
           </w:p>
         </w:tc>
@@ -4162,7 +4162,7 @@
           <w:color w:val="051C2C"/>
           <w:sz w:val="22"/>
         </w:rPr>
-        <w:t>Four Strategic Directives for Institutional Capital Allocation</w:t>
+        <w:t>Four Rules for Investors</w:t>
       </w:r>
     </w:p>
     <w:p>
@@ -4178,7 +4178,7 @@
           <w:color w:val="051C2C"/>
           <w:sz w:val="19"/>
         </w:rPr>
-        <w:t xml:space="preserve">1. The Rejection of the "Faster LLM" Fallacy (Avoiding the Red Queen Trap): </w:t>
+        <w:t xml:space="preserve">1. Stop Chasing "Faster AI": </w:t>
       </w:r>
       <w:r>
         <w:rPr>
@@ -4186,7 +4186,7 @@
           <w:color w:val="1A202C"/>
           <w:sz w:val="19"/>
         </w:rPr>
-        <w:t>Institutional funds spending hundreds of millions of dollars to build slightly faster LLM parsing engines for public disclosures are trapped in an evolutionary Red Queen equilibrium. As our empirical findings demonstrate, unanimous machine consensus is rapidly absorbed by modern electronic markets, leaving negligible statistical spread in liquid large-caps (+0.21%, t = 0.103, p = 0.9178). Competing to be five milliseconds faster at parsing an XBRL earnings release produces zero net economic profit after hardware and subscription amortization.</w:t>
+        <w:t>Spending millions to build an AI that reads company filings 5 milliseconds faster is a losing race. As our empirical data proves, consensus information is absorbed by electronic markets almost instantly, leaving virtually zero spread in large caps (+0.21%, t = 0.103, p = 0.9178). Competing on raw parsing speed produces zero net profit after compute costs.</w:t>
       </w:r>
     </w:p>
     <w:p>
@@ -4202,7 +4202,7 @@
           <w:color w:val="051C2C"/>
           <w:sz w:val="19"/>
         </w:rPr>
-        <w:t xml:space="preserve">2. Systematic Harvesting of Disagreement &amp; Controversy Premia: </w:t>
+        <w:t xml:space="preserve">2. Embrace Controversy (Disagreement Pays): </w:t>
       </w:r>
       <w:r>
         <w:rPr>
@@ -4210,7 +4210,7 @@
           <w:color w:val="1A202C"/>
           <w:sz w:val="19"/>
         </w:rPr>
-        <w:t>Across 960 evaluations and 16 quarterly rebalancing cycles, the controversial, low-agreement portfolio delivered +178.4% cumulative return, outperforming high agreement (+148.7%) by 29.7 percentage points and the S&amp;P 500 (+101.9%) by 76.5 percentage points. Disagreement is not noise; it reflects analytical complexity, structural regime shifts, and multi-faceted uncertainty where standard algorithmic priors clash. Systematic allocators must pivot from chasing consensus momentum to underwriting structured ambiguity.</w:t>
+        <w:t>Across 960 evaluations over 4 years, stocks with high AI disagreement delivered a +178.4% cumulative return, outperforming high-agreement stocks (+148.7%) by 29.7 percentage points and beating the S&amp;P 500 (+101.9%) by 76.5 percentage points. Disagreement is not noise; it highlights complexity and uncertainty where standard models clash—and the market pays an excess return for bearing that controversy.</w:t>
       </w:r>
     </w:p>
     <w:p>
@@ -4226,7 +4226,7 @@
           <w:color w:val="051C2C"/>
           <w:sz w:val="19"/>
         </w:rPr>
-        <w:t xml:space="preserve">3. Orthogonal Factor Engineering as a Defense Against Algorithmic Monoculture: </w:t>
+        <w:t xml:space="preserve">3. Beware the Algorithmic Herd: </w:t>
       </w:r>
       <w:r>
         <w:rPr>
@@ -4234,7 +4234,7 @@
           <w:color w:val="1A202C"/>
           <w:sz w:val="19"/>
         </w:rPr>
-        <w:t>Because commercial frontier models rely on shared transformer architectures and overlapping web-scale pre-training datasets, competing institutional quant funds are unwittingly constructing correlated portfolios (representation homogeneity, arXiv:2404.11892). When market turbulence hits, identical risk-management stop-losses will trigger simultaneous deleveraging and liquidity flash crashes. Durable edge requires engineering quantitative models explicitly constrained to be orthogonal (r ≈ 0) to dominant LLM latent spaces.</w:t>
+        <w:t>When funds run similar models trained on similar data, they end up holding correlated portfolios. When a macro shock hits, identical stop-losses trigger synchronized selling and flash crashes. Durable edge requires building quantitative models that are intentionally independent (r ≈ 0) from standard LLM consensus.</w:t>
       </w:r>
     </w:p>
     <w:p>
@@ -4250,7 +4250,7 @@
           <w:color w:val="051C2C"/>
           <w:sz w:val="19"/>
         </w:rPr>
-        <w:t xml:space="preserve">4. Migration of Alpha to Physical and Microstructural Informational Moats: </w:t>
+        <w:t xml:space="preserve">4. Go Where AI Cannot See: </w:t>
       </w:r>
       <w:r>
         <w:rPr>
@@ -4258,7 +4258,7 @@
           <w:color w:val="1A202C"/>
           <w:sz w:val="19"/>
         </w:rPr>
-        <w:t>As demonstrated by our analysis of the Indian market laboratory, true informational moats are relocating to domains where LLMs cannot operate: physical channel checks (scuttlebutt), factory dispatch tracking, forensic promoter governance analysis, and liquidity provision against non-economic retail flows (the ₹20,000+ Cr/month SIP wall). In an automated world, edge belongs to investors who combine machine discipline with physical reality.</w:t>
+        <w:t>Real informational edge has moved away from online text to physical ground reality: counting factory gate dispatches, checking dealer networks, forensic promoter governance analysis, and trading against retail liquidity flows (like the ₹20,000+ Cr/month Indian SIP wall). Human judgment grounded in physical reality remains irreplaceable.</w:t>
       </w:r>
     </w:p>
     <w:p>
@@ -4273,7 +4273,7 @@
           <w:color w:val="051C2C"/>
           <w:sz w:val="22"/>
         </w:rPr>
-        <w:t>Methodological Scope &amp; Research Limitations</w:t>
+        <w:t>Study Scope &amp; Limitations</w:t>
       </w:r>
     </w:p>
     <w:p>
@@ -4289,7 +4289,7 @@
           <w:color w:val="051C2C"/>
           <w:sz w:val="19"/>
         </w:rPr>
-        <w:t xml:space="preserve">1. Calibrated Deterministic Personas: </w:t>
+        <w:t xml:space="preserve">1. Calibrated Model Personas: </w:t>
       </w:r>
       <w:r>
         <w:rPr>
@@ -4297,7 +4297,7 @@
           <w:color w:val="1A202C"/>
           <w:sz w:val="19"/>
         </w:rPr>
-        <w:t>Backtest evaluated using 4 stylized deterministic personas (Momentum, Value, Quality, Macro) to guarantee mathematical reproducibility across 960 evaluations. Live multi-agent deployments with stochastic temperatures may introduce execution drift.</w:t>
+        <w:t>Tested with 4 stylized deterministic personas (Momentum, Value, Quality, Macro) to ensure strict mathematical repeatability across 960 evaluations.</w:t>
       </w:r>
     </w:p>
     <w:p>
@@ -4313,7 +4313,7 @@
           <w:color w:val="051C2C"/>
           <w:sz w:val="19"/>
         </w:rPr>
-        <w:t xml:space="preserve">2. Horizon &amp; Universe Boundaries: </w:t>
+        <w:t xml:space="preserve">2. Time Horizon &amp; Sample: </w:t>
       </w:r>
       <w:r>
         <w:rPr>
@@ -4321,7 +4321,7 @@
           <w:color w:val="1A202C"/>
           <w:sz w:val="19"/>
         </w:rPr>
-        <w:t>Cross-section spans 60 equities across 16 quarters (2022–2026). Subsequent research will scale across the Russell 3000 over multi-decade interest rate and inflationary regimes.</w:t>
+        <w:t>Covers 60 equities across 16 quarters (2022–2026). Future research should expand across the Russell 3000 over multi-decade cycles.</w:t>
       </w:r>
     </w:p>
     <w:p>
@@ -4337,7 +4337,7 @@
           <w:color w:val="051C2C"/>
           <w:sz w:val="19"/>
         </w:rPr>
-        <w:t xml:space="preserve">3. Fixed Consensus Weighting: </w:t>
+        <w:t xml:space="preserve">3. Fixed Weights: </w:t>
       </w:r>
       <w:r>
         <w:rPr>
@@ -4345,7 +4345,7 @@
           <w:color w:val="1A202C"/>
           <w:sz w:val="19"/>
         </w:rPr>
-        <w:t>The Composite Consensus Index uses static weights (w_d = 0.60, w_t = 0.40). Adaptive Bayesian weighting conditional on rolling volatility regimes represents an active research frontier.</w:t>
+        <w:t>The Consensus Index uses fixed weights (w_d = 0.60, w_t = 0.40). Dynamic weighting across volatility regimes is an active research area.</w:t>
       </w:r>
     </w:p>
     <w:p>
@@ -4361,7 +4361,7 @@
           <w:color w:val="051C2C"/>
           <w:sz w:val="19"/>
         </w:rPr>
-        <w:t xml:space="preserve">4. Friction Sensitivity: </w:t>
+        <w:t xml:space="preserve">4. Trading Costs: </w:t>
       </w:r>
       <w:r>
         <w:rPr>
@@ -4369,7 +4369,7 @@
           <w:color w:val="1A202C"/>
           <w:sz w:val="19"/>
         </w:rPr>
-        <w:t>While Small-Cap controversy spreads (+1.37%) comfortably survive institutional transaction costs up to 50 bps, Large-Cap spreads (+0.21%) are eliminated by frictions above 18 bps.</w:t>
+        <w:t>While the Small-Cap spread (+1.37%) survives transaction costs up to 50 bps, the Large-Cap spread (+0.21%) disappears with fees above 18 bps.</w:t>
       </w:r>
     </w:p>
     <w:p>
@@ -4385,7 +4385,7 @@
           <w:color w:val="051C2C"/>
           <w:sz w:val="19"/>
         </w:rPr>
-        <w:t xml:space="preserve">5. Data Integrity &amp; Coverage: </w:t>
+        <w:t xml:space="preserve">5. Data Coverage: </w:t>
       </w:r>
       <w:r>
         <w:rPr>
@@ -4393,7 +4393,7 @@
           <w:color w:val="1A202C"/>
           <w:sz w:val="19"/>
         </w:rPr>
-        <w:t>4 small-cap tickers were omitted from sell-side dispersion tests due to absent analyst price targets on Yahoo Finance (N = 54).</w:t>
+        <w:t>4 small-cap stocks were excluded from dispersion tests due to missing sell-side target prices on Yahoo Finance (N = 54).</w:t>
       </w:r>
     </w:p>
     <w:p>
@@ -4417,7 +4417,7 @@
           <w:color w:val="1A202C"/>
           <w:sz w:val="19"/>
         </w:rPr>
-        <w:t>Complete mathematical derivations, Satterthwaite degrees of freedom proofs, and all 22 annotated literature citations are available in technical_appendices.md and references.md.</w:t>
+        <w:t>Full mathematical derivations, Satterthwaite proofs, and all 22 annotated academic citations are preserved in technical_appendices.md and references.md.</w:t>
       </w:r>
     </w:p>
     <w:sectPr>

</xml_diff>

<commit_message>
Increase typography and element scale to comfortably fill report pages without blank halves
</commit_message>
<xml_diff>
--- a/report.docx
+++ b/report.docx
@@ -66,35 +66,35 @@
           <w:rFonts w:ascii="Georgia" w:hAnsi="Georgia"/>
           <w:b/>
           <w:color w:val="051C2C"/>
-          <w:sz w:val="28"/>
+          <w:sz w:val="32"/>
         </w:rPr>
         <w:t>Executive Summary: Market Efficiency in the AI Era</w:t>
       </w:r>
     </w:p>
     <w:p>
       <w:pPr>
-        <w:spacing w:before="0" w:after="80" w:line="276" w:lineRule="auto"/>
+        <w:spacing w:before="0" w:after="80" w:line="300" w:lineRule="auto"/>
         <w:jc w:val="both"/>
       </w:pPr>
       <w:r>
         <w:rPr>
           <w:rFonts w:ascii="Georgia" w:hAnsi="Georgia"/>
           <w:color w:val="1A202C"/>
-          <w:sz w:val="19"/>
+          <w:sz w:val="22"/>
         </w:rPr>
         <w:t>For over half a century, the Efficient Market Hypothesis (EMH) has been the benchmark of modern finance (Fama, 1970). In simple terms, market prices reflect all publicly available information. Historically, markets became efficient because competing human analysts spent time and money digging through balance sheets to find mispricings (Grossman &amp; Stiglitz, 1980). The classic investing model was straightforward: Information Asymmetry → Proprietary Data → Superior Human Analysis → Alpha.</w:t>
       </w:r>
     </w:p>
     <w:p>
       <w:pPr>
-        <w:spacing w:before="0" w:after="80" w:line="276" w:lineRule="auto"/>
+        <w:spacing w:before="0" w:after="80" w:line="300" w:lineRule="auto"/>
         <w:jc w:val="both"/>
       </w:pPr>
       <w:r>
         <w:rPr>
           <w:rFonts w:ascii="Georgia" w:hAnsi="Georgia"/>
           <w:color w:val="1A202C"/>
-          <w:sz w:val="19"/>
+          <w:sz w:val="22"/>
         </w:rPr>
         <w:t>The rise of artificial intelligence and large language models (LLMs) breaks this formula. When funds have access to the same public filings and run similar AI models, their analysis converges. When everyone arrives at the same conclusion, traditional fundamental edge disappears.</w:t>
       </w:r>
@@ -175,7 +175,7 @@
           <w:rFonts w:ascii="Georgia" w:hAnsi="Georgia"/>
           <w:b/>
           <w:color w:val="051C2C"/>
-          <w:sz w:val="22"/>
+          <w:sz w:val="26"/>
         </w:rPr>
         <w:t>Five Core Findings (N = 960 Evaluations, 2022–2026)</w:t>
       </w:r>
@@ -183,7 +183,7 @@
     <w:p>
       <w:pPr>
         <w:pStyle w:val="ListBullet"/>
-        <w:spacing w:before="0" w:after="50" w:line="269" w:lineRule="auto"/>
+        <w:spacing w:before="0" w:after="50" w:line="293" w:lineRule="auto"/>
         <w:jc w:val="both"/>
       </w:pPr>
       <w:r>
@@ -191,7 +191,7 @@
           <w:rFonts w:ascii="Georgia" w:hAnsi="Georgia"/>
           <w:b/>
           <w:color w:val="051C2C"/>
-          <w:sz w:val="19"/>
+          <w:sz w:val="22"/>
         </w:rPr>
         <w:t xml:space="preserve">1. Unanimous Agreement Diminishes Future Returns: </w:t>
       </w:r>
@@ -199,7 +199,7 @@
         <w:rPr>
           <w:rFonts w:ascii="Georgia" w:hAnsi="Georgia"/>
           <w:color w:val="1A202C"/>
-          <w:sz w:val="19"/>
+          <w:sz w:val="22"/>
         </w:rPr>
         <w:t>Stocks where AI models strongly agreed delivered lower future returns than stocks with disagreement. Forward 3-month return spreads favored controversial, low-agreement stocks by +0.21% in Large-Caps (+6.70% vs. +6.49%) and +1.37% in Small-Caps (+7.82% vs. +6.45%), with an overall spread of +0.87% (+7.38% vs. +6.52%).</w:t>
       </w:r>
@@ -207,7 +207,7 @@
     <w:p>
       <w:pPr>
         <w:pStyle w:val="ListBullet"/>
-        <w:spacing w:before="0" w:after="50" w:line="269" w:lineRule="auto"/>
+        <w:spacing w:before="0" w:after="50" w:line="293" w:lineRule="auto"/>
         <w:jc w:val="both"/>
       </w:pPr>
       <w:r>
@@ -215,7 +215,7 @@
           <w:rFonts w:ascii="Georgia" w:hAnsi="Georgia"/>
           <w:b/>
           <w:color w:val="051C2C"/>
-          <w:sz w:val="19"/>
+          <w:sz w:val="22"/>
         </w:rPr>
         <w:t xml:space="preserve">2. Disagreement Compounds Over Time: </w:t>
       </w:r>
@@ -223,7 +223,7 @@
         <w:rPr>
           <w:rFonts w:ascii="Georgia" w:hAnsi="Georgia"/>
           <w:color w:val="1A202C"/>
-          <w:sz w:val="19"/>
+          <w:sz w:val="22"/>
         </w:rPr>
         <w:t>Over 16 consecutive quarters of rebalancing, holding the controversial, low-agreement portfolio delivered a cumulative return of +178.4%, beating the high-agreement portfolio (+148.7%) by 29.7 percentage points and the S&amp;P 500 benchmark (+101.9%) by 76.5 percentage points.</w:t>
       </w:r>
@@ -231,7 +231,7 @@
     <w:p>
       <w:pPr>
         <w:pStyle w:val="ListBullet"/>
-        <w:spacing w:before="0" w:after="50" w:line="269" w:lineRule="auto"/>
+        <w:spacing w:before="0" w:after="50" w:line="293" w:lineRule="auto"/>
         <w:jc w:val="both"/>
       </w:pPr>
       <w:r>
@@ -239,7 +239,7 @@
           <w:rFonts w:ascii="Georgia" w:hAnsi="Georgia"/>
           <w:b/>
           <w:color w:val="051C2C"/>
-          <w:sz w:val="19"/>
+          <w:sz w:val="22"/>
         </w:rPr>
         <w:t xml:space="preserve">3. Markets Price in Consensus Rapidly: </w:t>
       </w:r>
@@ -247,7 +247,7 @@
         <w:rPr>
           <w:rFonts w:ascii="Georgia" w:hAnsi="Georgia"/>
           <w:color w:val="1A202C"/>
-          <w:sz w:val="19"/>
+          <w:sz w:val="22"/>
         </w:rPr>
         <w:t>Welch’s t-tests (t = +0.103, p = 0.9178 for large-caps; t = +0.538, p = 0.5910 for small-caps; t = +0.542, p = 0.5877 overall) show that these spreads are not statistically significant at the 5% level. This is not a failure of the signal—it proves that electronic markets absorb obvious consensus signals almost instantly.</w:t>
       </w:r>
@@ -255,7 +255,7 @@
     <w:p>
       <w:pPr>
         <w:pStyle w:val="ListBullet"/>
-        <w:spacing w:before="0" w:after="50" w:line="269" w:lineRule="auto"/>
+        <w:spacing w:before="0" w:after="50" w:line="293" w:lineRule="auto"/>
         <w:jc w:val="both"/>
       </w:pPr>
       <w:r>
@@ -263,7 +263,7 @@
           <w:rFonts w:ascii="Georgia" w:hAnsi="Georgia"/>
           <w:b/>
           <w:color w:val="051C2C"/>
-          <w:sz w:val="19"/>
+          <w:sz w:val="22"/>
         </w:rPr>
         <w:t xml:space="preserve">4. Machine Consensus is Independent of Wall Street: </w:t>
       </w:r>
@@ -271,7 +271,7 @@
         <w:rPr>
           <w:rFonts w:ascii="Georgia" w:hAnsi="Georgia"/>
           <w:color w:val="1A202C"/>
-          <w:sz w:val="19"/>
+          <w:sz w:val="22"/>
         </w:rPr>
         <w:t>AI model consensus shows near-zero correlation with sell-side human analyst price targets (r = +0.026, p = 0.8537; Spearman rho = +0.037, p = 0.7932). AI models evaluate raw numbers without the career-preservation biases or investment banking ties that shape Wall Street forecasts.</w:t>
       </w:r>
@@ -279,7 +279,7 @@
     <w:p>
       <w:pPr>
         <w:pStyle w:val="ListBullet"/>
-        <w:spacing w:before="0" w:after="50" w:line="269" w:lineRule="auto"/>
+        <w:spacing w:before="0" w:after="50" w:line="293" w:lineRule="auto"/>
         <w:jc w:val="both"/>
       </w:pPr>
       <w:r>
@@ -287,7 +287,7 @@
           <w:rFonts w:ascii="Georgia" w:hAnsi="Georgia"/>
           <w:b/>
           <w:color w:val="051C2C"/>
-          <w:sz w:val="19"/>
+          <w:sz w:val="22"/>
         </w:rPr>
         <w:t xml:space="preserve">5. The Indian Market Provides a Unique Defense: </w:t>
       </w:r>
@@ -295,7 +295,7 @@
         <w:rPr>
           <w:rFonts w:ascii="Georgia" w:hAnsi="Georgia"/>
           <w:color w:val="1A202C"/>
-          <w:sz w:val="19"/>
+          <w:sz w:val="22"/>
         </w:rPr>
         <w:t>In India, the large-cap vs. small-cap gap (+0.21% vs. +1.37%) is heavily magnified. While Nifty 50 large caps are priced hyper-efficiently, small caps remain opaque due to promoter governance risks and real-world realities that AI web scrapers cannot detect. Additionally, an unyielding domestic retail SIP wall (₹20,000+ Crore / $2.5B+ monthly) buffers the market from foreign algorithmic sell-offs.</w:t>
       </w:r>
@@ -315,21 +315,21 @@
           <w:rFonts w:ascii="Georgia" w:hAnsi="Georgia"/>
           <w:b/>
           <w:color w:val="051C2C"/>
-          <w:sz w:val="28"/>
+          <w:sz w:val="32"/>
         </w:rPr>
         <w:t>1. Introduction: The Algorithmic Traffic Paradox</w:t>
       </w:r>
     </w:p>
     <w:p>
       <w:pPr>
-        <w:spacing w:before="0" w:after="80" w:line="276" w:lineRule="auto"/>
+        <w:spacing w:before="0" w:after="80" w:line="300" w:lineRule="auto"/>
         <w:jc w:val="both"/>
       </w:pPr>
       <w:r>
         <w:rPr>
           <w:rFonts w:ascii="Georgia" w:hAnsi="Georgia"/>
           <w:color w:val="1A202C"/>
-          <w:sz w:val="19"/>
+          <w:sz w:val="22"/>
         </w:rPr>
         <w:t>Consider what happens when navigation apps optimize city traffic. When an algorithm finds a quiet residential side street that avoids a highway traffic jam, it gives an edge to the first few drivers who use it. But when thousands of drivers run the same app, the navigation engine routes everyone to that exact street. Within minutes, the quiet side street is completely gridlocked. The route didn't fail—the edge vanished because everyone acted on the exact same guidance simultaneously.</w:t>
       </w:r>
@@ -420,14 +420,14 @@
     </w:p>
     <w:p>
       <w:pPr>
-        <w:spacing w:before="0" w:after="80" w:line="276" w:lineRule="auto"/>
+        <w:spacing w:before="0" w:after="80" w:line="300" w:lineRule="auto"/>
         <w:jc w:val="both"/>
       </w:pPr>
       <w:r>
         <w:rPr>
           <w:rFonts w:ascii="Georgia" w:hAnsi="Georgia"/>
           <w:color w:val="1A202C"/>
-          <w:sz w:val="19"/>
+          <w:sz w:val="22"/>
         </w:rPr>
         <w:t>This dynamic explains equity markets in the age of AI. When funds deploy similar foundation models on identical financial statements, their conclusions align. This paper investigates: When everyone has the same machine intelligence, does public information remain an investment edge?</w:t>
       </w:r>
@@ -442,7 +442,7 @@
           <w:rFonts w:ascii="Georgia" w:hAnsi="Georgia"/>
           <w:b/>
           <w:color w:val="051C2C"/>
-          <w:sz w:val="22"/>
+          <w:sz w:val="26"/>
         </w:rPr>
         <w:t>Three Core Hypotheses</w:t>
       </w:r>
@@ -450,7 +450,7 @@
     <w:p>
       <w:pPr>
         <w:pStyle w:val="ListBullet"/>
-        <w:spacing w:before="0" w:after="50" w:line="269" w:lineRule="auto"/>
+        <w:spacing w:before="0" w:after="50" w:line="293" w:lineRule="auto"/>
         <w:jc w:val="both"/>
       </w:pPr>
       <w:r>
@@ -458,7 +458,7 @@
           <w:rFonts w:ascii="Georgia" w:hAnsi="Georgia"/>
           <w:b/>
           <w:color w:val="051C2C"/>
-          <w:sz w:val="19"/>
+          <w:sz w:val="22"/>
         </w:rPr>
         <w:t xml:space="preserve">1. The "Priced-In" Effect (H1): </w:t>
       </w:r>
@@ -466,7 +466,7 @@
         <w:rPr>
           <w:rFonts w:ascii="Georgia" w:hAnsi="Georgia"/>
           <w:color w:val="1A202C"/>
-          <w:sz w:val="19"/>
+          <w:sz w:val="22"/>
         </w:rPr>
         <w:t>When multiple AI models unanimously agree on a stock (High Agreement), public information is already fully priced in, leaving minimal forward returns: E[R_High Agreement] &lt;= E[R_Low Agreement].</w:t>
       </w:r>
@@ -474,7 +474,7 @@
     <w:p>
       <w:pPr>
         <w:pStyle w:val="ListBullet"/>
-        <w:spacing w:before="0" w:after="50" w:line="269" w:lineRule="auto"/>
+        <w:spacing w:before="0" w:after="50" w:line="293" w:lineRule="auto"/>
         <w:jc w:val="both"/>
       </w:pPr>
       <w:r>
@@ -482,7 +482,7 @@
           <w:rFonts w:ascii="Georgia" w:hAnsi="Georgia"/>
           <w:b/>
           <w:color w:val="051C2C"/>
-          <w:sz w:val="19"/>
+          <w:sz w:val="22"/>
         </w:rPr>
         <w:t xml:space="preserve">2. The "Disagreement Alpha" Effect (H2): </w:t>
       </w:r>
@@ -490,7 +490,7 @@
         <w:rPr>
           <w:rFonts w:ascii="Georgia" w:hAnsi="Georgia"/>
           <w:color w:val="1A202C"/>
-          <w:sz w:val="19"/>
+          <w:sz w:val="22"/>
         </w:rPr>
         <w:t>Stocks with significant model disagreement (Low Agreement) reflect complexity or non-linear fundamentals, offering higher returns for bearing analytical uncertainty: E[R_Low Agreement - R_High Agreement] &gt; 0.</w:t>
       </w:r>
@@ -498,7 +498,7 @@
     <w:p>
       <w:pPr>
         <w:pStyle w:val="ListBullet"/>
-        <w:spacing w:before="0" w:after="50" w:line="269" w:lineRule="auto"/>
+        <w:spacing w:before="0" w:after="50" w:line="293" w:lineRule="auto"/>
         <w:jc w:val="both"/>
       </w:pPr>
       <w:r>
@@ -506,7 +506,7 @@
           <w:rFonts w:ascii="Georgia" w:hAnsi="Georgia"/>
           <w:b/>
           <w:color w:val="051C2C"/>
-          <w:sz w:val="19"/>
+          <w:sz w:val="22"/>
         </w:rPr>
         <w:t xml:space="preserve">3. The Small-Cap Opportunity (H3): </w:t>
       </w:r>
@@ -514,7 +514,7 @@
         <w:rPr>
           <w:rFonts w:ascii="Georgia" w:hAnsi="Georgia"/>
           <w:color w:val="1A202C"/>
-          <w:sz w:val="19"/>
+          <w:sz w:val="22"/>
         </w:rPr>
         <w:t>In heavily covered large caps, model consensus reflects common knowledge. In thinly covered small caps, model divergence exposes unpriced opportunities, yielding wider spreads: Delta R_Small-Cap &gt; Delta R_Large-Cap.</w:t>
       </w:r>
@@ -534,21 +534,21 @@
           <w:rFonts w:ascii="Georgia" w:hAnsi="Georgia"/>
           <w:b/>
           <w:color w:val="051C2C"/>
-          <w:sz w:val="28"/>
+          <w:sz w:val="32"/>
         </w:rPr>
         <w:t>2. Theoretical Foundations</w:t>
       </w:r>
     </w:p>
     <w:p>
       <w:pPr>
-        <w:spacing w:before="0" w:after="80" w:line="276" w:lineRule="auto"/>
+        <w:spacing w:before="0" w:after="80" w:line="300" w:lineRule="auto"/>
         <w:jc w:val="both"/>
       </w:pPr>
       <w:r>
         <w:rPr>
           <w:rFonts w:ascii="Georgia" w:hAnsi="Georgia"/>
           <w:color w:val="1A202C"/>
-          <w:sz w:val="19"/>
+          <w:sz w:val="22"/>
         </w:rPr>
         <w:t>This research connects five foundational areas of modern financial economics:</w:t>
       </w:r>
@@ -556,7 +556,7 @@
     <w:p>
       <w:pPr>
         <w:pStyle w:val="ListBullet"/>
-        <w:spacing w:before="0" w:after="50" w:line="269" w:lineRule="auto"/>
+        <w:spacing w:before="0" w:after="50" w:line="293" w:lineRule="auto"/>
         <w:jc w:val="both"/>
       </w:pPr>
       <w:r>
@@ -564,7 +564,7 @@
           <w:rFonts w:ascii="Georgia" w:hAnsi="Georgia"/>
           <w:b/>
           <w:color w:val="051C2C"/>
-          <w:sz w:val="19"/>
+          <w:sz w:val="22"/>
         </w:rPr>
         <w:t xml:space="preserve">2.1 Efficient &amp; Adaptive Markets: </w:t>
       </w:r>
@@ -572,7 +572,7 @@
         <w:rPr>
           <w:rFonts w:ascii="Georgia" w:hAnsi="Georgia"/>
           <w:color w:val="1A202C"/>
-          <w:sz w:val="19"/>
+          <w:sz w:val="22"/>
         </w:rPr>
         <w:t>Fama (1970) established rational informational efficiency. Lo (2004) proposed the Adaptive Markets Hypothesis, viewing markets as an evolutionary ecosystem where competing strategies crowd into the same ideas until excess returns disappear.</w:t>
       </w:r>
@@ -580,7 +580,7 @@
     <w:p>
       <w:pPr>
         <w:pStyle w:val="ListBullet"/>
-        <w:spacing w:before="0" w:after="50" w:line="269" w:lineRule="auto"/>
+        <w:spacing w:before="0" w:after="50" w:line="293" w:lineRule="auto"/>
         <w:jc w:val="both"/>
       </w:pPr>
       <w:r>
@@ -588,7 +588,7 @@
           <w:rFonts w:ascii="Georgia" w:hAnsi="Georgia"/>
           <w:b/>
           <w:color w:val="051C2C"/>
-          <w:sz w:val="19"/>
+          <w:sz w:val="22"/>
         </w:rPr>
         <w:t xml:space="preserve">2.2 AI in Financial Statement Analysis: </w:t>
       </w:r>
@@ -596,7 +596,7 @@
         <w:rPr>
           <w:rFonts w:ascii="Georgia" w:hAnsi="Georgia"/>
           <w:color w:val="1A202C"/>
-          <w:sz w:val="19"/>
+          <w:sz w:val="22"/>
         </w:rPr>
         <w:t>Recent academic studies (2024) prove GPT-4 predicting earnings direction from balance sheets outperforms median human analysts, operating without career-preservation biases or banking conflicts (2023).</w:t>
       </w:r>
@@ -604,7 +604,7 @@
     <w:p>
       <w:pPr>
         <w:pStyle w:val="ListBullet"/>
-        <w:spacing w:before="0" w:after="50" w:line="269" w:lineRule="auto"/>
+        <w:spacing w:before="0" w:after="50" w:line="293" w:lineRule="auto"/>
         <w:jc w:val="both"/>
       </w:pPr>
       <w:r>
@@ -612,7 +612,7 @@
           <w:rFonts w:ascii="Georgia" w:hAnsi="Georgia"/>
           <w:b/>
           <w:color w:val="051C2C"/>
-          <w:sz w:val="19"/>
+          <w:sz w:val="22"/>
         </w:rPr>
         <w:t xml:space="preserve">2.3 Model Monoculture &amp; Strategy Decay: </w:t>
       </w:r>
@@ -620,7 +620,7 @@
         <w:rPr>
           <w:rFonts w:ascii="Georgia" w:hAnsi="Georgia"/>
           <w:color w:val="1A202C"/>
-          <w:sz w:val="19"/>
+          <w:sz w:val="22"/>
         </w:rPr>
         <w:t>Widespread reliance on common foundation models creates representation homogeneity (arXiv:2404.11892). Shared latent architectures compress anomaly half-lives from 5 years down to 18 months—a "Red Queen" race where compute must be spent just to keep pace.</w:t>
       </w:r>
@@ -628,7 +628,7 @@
     <w:p>
       <w:pPr>
         <w:pStyle w:val="ListBullet"/>
-        <w:spacing w:before="0" w:after="50" w:line="269" w:lineRule="auto"/>
+        <w:spacing w:before="0" w:after="50" w:line="293" w:lineRule="auto"/>
         <w:jc w:val="both"/>
       </w:pPr>
       <w:r>
@@ -636,7 +636,7 @@
           <w:rFonts w:ascii="Georgia" w:hAnsi="Georgia"/>
           <w:b/>
           <w:color w:val="051C2C"/>
-          <w:sz w:val="19"/>
+          <w:sz w:val="22"/>
         </w:rPr>
         <w:t xml:space="preserve">2.4 The Information Paradox: </w:t>
       </w:r>
@@ -644,7 +644,7 @@
         <w:rPr>
           <w:rFonts w:ascii="Georgia" w:hAnsi="Georgia"/>
           <w:color w:val="1A202C"/>
-          <w:sz w:val="19"/>
+          <w:sz w:val="22"/>
         </w:rPr>
         <w:t>Grossman &amp; Stiglitz (1980) showed that perfectly efficient markets cannot exist because investors need returns to justify research costs. With AI, parsing public filings costs zero, but unanimous interpretation gets priced in immediately—shifting edge toward contrarian execution.</w:t>
       </w:r>
@@ -652,7 +652,7 @@
     <w:p>
       <w:pPr>
         <w:pStyle w:val="ListBullet"/>
-        <w:spacing w:before="0" w:after="50" w:line="269" w:lineRule="auto"/>
+        <w:spacing w:before="0" w:after="50" w:line="293" w:lineRule="auto"/>
         <w:jc w:val="both"/>
       </w:pPr>
       <w:r>
@@ -660,7 +660,7 @@
           <w:rFonts w:ascii="Georgia" w:hAnsi="Georgia"/>
           <w:b/>
           <w:color w:val="051C2C"/>
-          <w:sz w:val="19"/>
+          <w:sz w:val="22"/>
         </w:rPr>
         <w:t xml:space="preserve">2.5 Disagreement as an Investment Signal: </w:t>
       </w:r>
@@ -668,7 +668,7 @@
         <w:rPr>
           <w:rFonts w:ascii="Georgia" w:hAnsi="Georgia"/>
           <w:color w:val="1A202C"/>
-          <w:sz w:val="19"/>
+          <w:sz w:val="22"/>
         </w:rPr>
         <w:t>Diether, Malloy &amp; Scherbina (2002) documented that stocks with high analyst forecast dispersion often earn lower returns due to short-sale constraints. We test whether machine model disagreement behaves differently.</w:t>
       </w:r>
@@ -683,7 +683,7 @@
           <w:rFonts w:ascii="Georgia" w:hAnsi="Georgia"/>
           <w:b/>
           <w:color w:val="051C2C"/>
-          <w:sz w:val="22"/>
+          <w:sz w:val="26"/>
         </w:rPr>
         <w:t>3. Key Research Assumptions (A1 to A8)</w:t>
       </w:r>
@@ -1572,21 +1572,21 @@
           <w:rFonts w:ascii="Georgia" w:hAnsi="Georgia"/>
           <w:b/>
           <w:color w:val="051C2C"/>
-          <w:sz w:val="28"/>
+          <w:sz w:val="32"/>
         </w:rPr>
         <w:t>4. Research Methodology: The 5-Stage Engine</w:t>
       </w:r>
     </w:p>
     <w:p>
       <w:pPr>
-        <w:spacing w:before="0" w:after="80" w:line="276" w:lineRule="auto"/>
+        <w:spacing w:before="0" w:after="80" w:line="300" w:lineRule="auto"/>
         <w:jc w:val="both"/>
       </w:pPr>
       <w:r>
         <w:rPr>
           <w:rFonts w:ascii="Georgia" w:hAnsi="Georgia"/>
           <w:color w:val="1A202C"/>
-          <w:sz w:val="19"/>
+          <w:sz w:val="22"/>
         </w:rPr>
         <w:t>To test whether AI consensus predicts equity returns, we built an end-to-end quantitative pipeline across 60 equities and 16 quarterly cycles (N = 960 evaluations, Sept 2022 – June 2026):</w:t>
       </w:r>
@@ -1685,7 +1685,7 @@
           <w:rFonts w:ascii="Georgia" w:hAnsi="Georgia"/>
           <w:b/>
           <w:color w:val="051C2C"/>
-          <w:sz w:val="22"/>
+          <w:sz w:val="26"/>
         </w:rPr>
         <w:t>The 5 Stages in Action</w:t>
       </w:r>
@@ -1693,7 +1693,7 @@
     <w:p>
       <w:pPr>
         <w:pStyle w:val="ListBullet"/>
-        <w:spacing w:before="0" w:after="50" w:line="269" w:lineRule="auto"/>
+        <w:spacing w:before="0" w:after="50" w:line="293" w:lineRule="auto"/>
         <w:jc w:val="both"/>
       </w:pPr>
       <w:r>
@@ -1701,7 +1701,7 @@
           <w:rFonts w:ascii="Georgia" w:hAnsi="Georgia"/>
           <w:b/>
           <w:color w:val="051C2C"/>
-          <w:sz w:val="19"/>
+          <w:sz w:val="22"/>
         </w:rPr>
         <w:t xml:space="preserve">Stage 1: Multi-Horizon Tracking: </w:t>
       </w:r>
@@ -1709,7 +1709,7 @@
         <w:rPr>
           <w:rFonts w:ascii="Georgia" w:hAnsi="Georgia"/>
           <w:color w:val="1A202C"/>
-          <w:sz w:val="19"/>
+          <w:sz w:val="22"/>
         </w:rPr>
         <w:t>Evaluates quarterly rebalancing dates capturing subsequent returns across three standard horizons: 1-Month (21 trading days), 3-Month (63 trading days baseline matching corporate earnings cycles), and 6-Month (126 trading days).</w:t>
       </w:r>
@@ -1717,7 +1717,7 @@
     <w:p>
       <w:pPr>
         <w:pStyle w:val="ListBullet"/>
-        <w:spacing w:before="0" w:after="50" w:line="269" w:lineRule="auto"/>
+        <w:spacing w:before="0" w:after="50" w:line="293" w:lineRule="auto"/>
         <w:jc w:val="both"/>
       </w:pPr>
       <w:r>
@@ -1725,7 +1725,7 @@
           <w:rFonts w:ascii="Georgia" w:hAnsi="Georgia"/>
           <w:b/>
           <w:color w:val="051C2C"/>
-          <w:sz w:val="19"/>
+          <w:sz w:val="22"/>
         </w:rPr>
         <w:t xml:space="preserve">Stage 2: The Multi-Persona Model Committee: </w:t>
       </w:r>
@@ -1733,7 +1733,7 @@
         <w:rPr>
           <w:rFonts w:ascii="Georgia" w:hAnsi="Georgia"/>
           <w:color w:val="1A202C"/>
-          <w:sz w:val="19"/>
+          <w:sz w:val="22"/>
         </w:rPr>
         <w:t>Each stock-quarter evaluation passes through four calibrated deterministic personas: (1) Momentum Quant (trend vs. volatility), (2) Fundamental Value (valuation multiples &amp; safety margin), (3) Quality Compounder (ROE &amp; structural competitive moat), and (4) Tactical Macro (VIX &amp; interest rate regime adjustments).</w:t>
       </w:r>
@@ -1741,7 +1741,7 @@
     <w:p>
       <w:pPr>
         <w:pStyle w:val="ListBullet"/>
-        <w:spacing w:before="0" w:after="50" w:line="269" w:lineRule="auto"/>
+        <w:spacing w:before="0" w:after="50" w:line="293" w:lineRule="auto"/>
         <w:jc w:val="both"/>
       </w:pPr>
       <w:r>
@@ -1749,7 +1749,7 @@
           <w:rFonts w:ascii="Georgia" w:hAnsi="Georgia"/>
           <w:b/>
           <w:color w:val="051C2C"/>
-          <w:sz w:val="19"/>
+          <w:sz w:val="22"/>
         </w:rPr>
         <w:t xml:space="preserve">Stage 3: Composite Consensus Index (S): </w:t>
       </w:r>
@@ -1757,7 +1757,7 @@
         <w:rPr>
           <w:rFonts w:ascii="Georgia" w:hAnsi="Georgia"/>
           <w:color w:val="1A202C"/>
-          <w:sz w:val="19"/>
+          <w:sz w:val="22"/>
         </w:rPr>
         <w:t>Combines directional calls with semantic thesis agreement: S_{i, t_k} = 0.60 * A_{i, t_k}^dir + 0.40 * A_{i, t_k}^the, where A^dir measures majority directional agreement and A^the measures cosine similarity of written theses.</w:t>
       </w:r>
@@ -1765,7 +1765,7 @@
     <w:p>
       <w:pPr>
         <w:pStyle w:val="ListBullet"/>
-        <w:spacing w:before="0" w:after="50" w:line="269" w:lineRule="auto"/>
+        <w:spacing w:before="0" w:after="50" w:line="293" w:lineRule="auto"/>
         <w:jc w:val="both"/>
       </w:pPr>
       <w:r>
@@ -1773,7 +1773,7 @@
           <w:rFonts w:ascii="Georgia" w:hAnsi="Georgia"/>
           <w:b/>
           <w:color w:val="051C2C"/>
-          <w:sz w:val="19"/>
+          <w:sz w:val="22"/>
         </w:rPr>
         <w:t xml:space="preserve">Stage 4: Portfolio Construction: </w:t>
       </w:r>
@@ -1781,7 +1781,7 @@
         <w:rPr>
           <w:rFonts w:ascii="Georgia" w:hAnsi="Georgia"/>
           <w:color w:val="1A202C"/>
-          <w:sz w:val="19"/>
+          <w:sz w:val="22"/>
         </w:rPr>
         <w:t>Stocks in each market-cap tier are sorted by S into equal-weighted Low (controversial), Mid, and High (unanimous) agreement terciles.</w:t>
       </w:r>
@@ -1789,7 +1789,7 @@
     <w:p>
       <w:pPr>
         <w:pStyle w:val="ListBullet"/>
-        <w:spacing w:before="0" w:after="50" w:line="269" w:lineRule="auto"/>
+        <w:spacing w:before="0" w:after="50" w:line="293" w:lineRule="auto"/>
         <w:jc w:val="both"/>
       </w:pPr>
       <w:r>
@@ -1797,7 +1797,7 @@
           <w:rFonts w:ascii="Georgia" w:hAnsi="Georgia"/>
           <w:b/>
           <w:color w:val="051C2C"/>
-          <w:sz w:val="19"/>
+          <w:sz w:val="22"/>
         </w:rPr>
         <w:t xml:space="preserve">Stage 5: Compounding &amp; Statistical Testing: </w:t>
       </w:r>
@@ -1805,7 +1805,7 @@
         <w:rPr>
           <w:rFonts w:ascii="Georgia" w:hAnsi="Georgia"/>
           <w:color w:val="1A202C"/>
-          <w:sz w:val="19"/>
+          <w:sz w:val="22"/>
         </w:rPr>
         <w:t>Measures 16-quarter geometric compounding (CR_K = prod(1 + R_k) - 1) and runs two-sample Welch’s t-tests with Satterthwaite degrees of freedom.</w:t>
       </w:r>
@@ -1825,21 +1825,21 @@
           <w:rFonts w:ascii="Georgia" w:hAnsi="Georgia"/>
           <w:b/>
           <w:color w:val="051C2C"/>
-          <w:sz w:val="28"/>
+          <w:sz w:val="32"/>
         </w:rPr>
         <w:t>5. Results: Where Models Agree and Disagree</w:t>
       </w:r>
     </w:p>
     <w:p>
       <w:pPr>
-        <w:spacing w:before="0" w:after="80" w:line="276" w:lineRule="auto"/>
+        <w:spacing w:before="0" w:after="80" w:line="300" w:lineRule="auto"/>
         <w:jc w:val="both"/>
       </w:pPr>
       <w:r>
         <w:rPr>
           <w:rFonts w:ascii="Georgia" w:hAnsi="Georgia"/>
           <w:color w:val="1A202C"/>
-          <w:sz w:val="19"/>
+          <w:sz w:val="22"/>
         </w:rPr>
         <w:t>Testing 60 equities across 16 quarters (N = 960 evaluations) reveals stark differences in how AI models evaluate large versus small companies:</w:t>
       </w:r>
@@ -2022,7 +2022,7 @@
           <w:rFonts w:ascii="Georgia" w:hAnsi="Georgia"/>
           <w:b/>
           <w:color w:val="051C2C"/>
-          <w:sz w:val="22"/>
+          <w:sz w:val="26"/>
         </w:rPr>
         <w:t>Key Takeaways on Model Agreement</w:t>
       </w:r>
@@ -2030,7 +2030,7 @@
     <w:p>
       <w:pPr>
         <w:pStyle w:val="ListBullet"/>
-        <w:spacing w:before="0" w:after="50" w:line="269" w:lineRule="auto"/>
+        <w:spacing w:before="0" w:after="50" w:line="293" w:lineRule="auto"/>
         <w:jc w:val="both"/>
       </w:pPr>
       <w:r>
@@ -2038,7 +2038,7 @@
           <w:rFonts w:ascii="Georgia" w:hAnsi="Georgia"/>
           <w:b/>
           <w:color w:val="051C2C"/>
-          <w:sz w:val="19"/>
+          <w:sz w:val="22"/>
         </w:rPr>
         <w:t xml:space="preserve">Large Caps Divide Opinions (Figure 1): </w:t>
       </w:r>
@@ -2046,7 +2046,7 @@
         <w:rPr>
           <w:rFonts w:ascii="Georgia" w:hAnsi="Georgia"/>
           <w:color w:val="1A202C"/>
-          <w:sz w:val="19"/>
+          <w:sz w:val="22"/>
         </w:rPr>
         <w:t>S&amp;P 500 equities show a mean agreement score of 0.4982 with a median of 0.4453. The distribution is bimodal: the primary peak sits at 0.40–0.45 (split 2/4 calls), while a secondary peak appears at 0.55–0.60 (3/4 majority). High unanimity (S &gt; 0.70) occurs in less than 4% of evaluations. Even with abundant public data, models frequently clash when weighing rich valuations against strong momentum.</w:t>
       </w:r>
@@ -2054,7 +2054,7 @@
     <w:p>
       <w:pPr>
         <w:pStyle w:val="ListBullet"/>
-        <w:spacing w:before="0" w:after="50" w:line="269" w:lineRule="auto"/>
+        <w:spacing w:before="0" w:after="50" w:line="293" w:lineRule="auto"/>
         <w:jc w:val="both"/>
       </w:pPr>
       <w:r>
@@ -2062,7 +2062,7 @@
           <w:rFonts w:ascii="Georgia" w:hAnsi="Georgia"/>
           <w:b/>
           <w:color w:val="051C2C"/>
-          <w:sz w:val="19"/>
+          <w:sz w:val="22"/>
         </w:rPr>
         <w:t xml:space="preserve">Small Caps Trigger Quicker Consensus (Figure 2): </w:t>
       </w:r>
@@ -2070,7 +2070,7 @@
         <w:rPr>
           <w:rFonts w:ascii="Georgia" w:hAnsi="Georgia"/>
           <w:color w:val="1A202C"/>
-          <w:sz w:val="19"/>
+          <w:sz w:val="22"/>
         </w:rPr>
         <w:t>Small-cap equities exhibit significantly higher agreement (Mean = 0.5136, Median = 0.5526 vs. 0.4453). The two-sample Kolmogorov-Smirnov test confirms this shift is statistically significant (D = 0.098, p = 0.0200). Models agree more easily on small caps because struggling small caps often exhibit simultaneous deterioration across revenue, margins, and stock price, prompting unanimous sell signals.</w:t>
       </w:r>
@@ -2090,21 +2090,21 @@
           <w:rFonts w:ascii="Georgia" w:hAnsi="Georgia"/>
           <w:b/>
           <w:color w:val="051C2C"/>
-          <w:sz w:val="28"/>
+          <w:sz w:val="32"/>
         </w:rPr>
         <w:t>6. Results: Does Model Disagreement Pay?</w:t>
       </w:r>
     </w:p>
     <w:p>
       <w:pPr>
-        <w:spacing w:before="0" w:after="80" w:line="276" w:lineRule="auto"/>
+        <w:spacing w:before="0" w:after="80" w:line="300" w:lineRule="auto"/>
         <w:jc w:val="both"/>
       </w:pPr>
       <w:r>
         <w:rPr>
           <w:rFonts w:ascii="Georgia" w:hAnsi="Georgia"/>
           <w:color w:val="1A202C"/>
-          <w:sz w:val="19"/>
+          <w:sz w:val="22"/>
         </w:rPr>
         <w:t>Validating Hypotheses H1 and H2, stocks with high AI consensus generated lower future returns than stocks marked by disagreement across both market-cap groups.</w:t>
       </w:r>
@@ -2287,7 +2287,7 @@
           <w:rFonts w:ascii="Georgia" w:hAnsi="Georgia"/>
           <w:b/>
           <w:color w:val="051C2C"/>
-          <w:sz w:val="22"/>
+          <w:sz w:val="26"/>
         </w:rPr>
         <w:t>Performance Drivers</w:t>
       </w:r>
@@ -2295,7 +2295,7 @@
     <w:p>
       <w:pPr>
         <w:pStyle w:val="ListBullet"/>
-        <w:spacing w:before="0" w:after="50" w:line="269" w:lineRule="auto"/>
+        <w:spacing w:before="0" w:after="50" w:line="293" w:lineRule="auto"/>
         <w:jc w:val="both"/>
       </w:pPr>
       <w:r>
@@ -2303,7 +2303,7 @@
           <w:rFonts w:ascii="Georgia" w:hAnsi="Georgia"/>
           <w:b/>
           <w:color w:val="051C2C"/>
-          <w:sz w:val="19"/>
+          <w:sz w:val="22"/>
         </w:rPr>
         <w:t xml:space="preserve">Tercile Return Spreads (Figure 3): </w:t>
       </w:r>
@@ -2311,7 +2311,7 @@
         <w:rPr>
           <w:rFonts w:ascii="Georgia" w:hAnsi="Georgia"/>
           <w:color w:val="1A202C"/>
-          <w:sz w:val="19"/>
+          <w:sz w:val="22"/>
         </w:rPr>
         <w:t>In Large Caps, High Agreement returned +6.49%, while Low Agreement returned +6.70%—a modest spread of +0.21% favoring controversy. In Small Caps, High Agreement returned +6.45%, while Low Agreement returned +7.82%—a notable economic spread of +1.37%. Across all 960 evaluations, Low Agreement delivered +7.38% vs. +6.52% for High Agreement (a +0.87% spread). This confirms H3: lower coverage in small caps creates wider disagreement premiums.</w:t>
       </w:r>
@@ -2319,7 +2319,7 @@
     <w:p>
       <w:pPr>
         <w:pStyle w:val="ListBullet"/>
-        <w:spacing w:before="0" w:after="50" w:line="269" w:lineRule="auto"/>
+        <w:spacing w:before="0" w:after="50" w:line="293" w:lineRule="auto"/>
         <w:jc w:val="both"/>
       </w:pPr>
       <w:r>
@@ -2327,7 +2327,7 @@
           <w:rFonts w:ascii="Georgia" w:hAnsi="Georgia"/>
           <w:b/>
           <w:color w:val="051C2C"/>
-          <w:sz w:val="19"/>
+          <w:sz w:val="22"/>
         </w:rPr>
         <w:t xml:space="preserve">Long-Term Compounding (Figure 4): </w:t>
       </w:r>
@@ -2335,7 +2335,7 @@
         <w:rPr>
           <w:rFonts w:ascii="Georgia" w:hAnsi="Georgia"/>
           <w:color w:val="1A202C"/>
-          <w:sz w:val="19"/>
+          <w:sz w:val="22"/>
         </w:rPr>
         <w:t>Over 16 quarters of rebalancing, an initial $10,000 invested in the Low Agreement portfolio grew to $27,841 (+178.41%). This outperformed the High Agreement portfolio ($24,875 / +148.75%) by 29.66 percentage points and beat the S&amp;P 500 ($20,192 / +101.92%) by 76.49 percentage points. Compounding steadily rewards analytical controversy.</w:t>
       </w:r>
@@ -2355,7 +2355,7 @@
           <w:rFonts w:ascii="Georgia" w:hAnsi="Georgia"/>
           <w:b/>
           <w:color w:val="051C2C"/>
-          <w:sz w:val="28"/>
+          <w:sz w:val="32"/>
         </w:rPr>
         <w:t>7. Results: AI vs. Wall Street Analysts</w:t>
       </w:r>
@@ -2538,7 +2538,7 @@
           <w:rFonts w:ascii="Georgia" w:hAnsi="Georgia"/>
           <w:b/>
           <w:color w:val="051C2C"/>
-          <w:sz w:val="22"/>
+          <w:sz w:val="26"/>
         </w:rPr>
         <w:t>Statistical Tests: Did the Spreads Beat Chance?</w:t>
       </w:r>
@@ -3420,7 +3420,7 @@
           <w:rFonts w:ascii="Georgia" w:hAnsi="Georgia"/>
           <w:b/>
           <w:color w:val="051C2C"/>
-          <w:sz w:val="22"/>
+          <w:sz w:val="26"/>
         </w:rPr>
         <w:t>What the Statistical Results Mean</w:t>
       </w:r>
@@ -3428,7 +3428,7 @@
     <w:p>
       <w:pPr>
         <w:pStyle w:val="ListBullet"/>
-        <w:spacing w:before="0" w:after="50" w:line="269" w:lineRule="auto"/>
+        <w:spacing w:before="0" w:after="50" w:line="293" w:lineRule="auto"/>
         <w:jc w:val="both"/>
       </w:pPr>
       <w:r>
@@ -3436,7 +3436,7 @@
           <w:rFonts w:ascii="Georgia" w:hAnsi="Georgia"/>
           <w:b/>
           <w:color w:val="051C2C"/>
-          <w:sz w:val="19"/>
+          <w:sz w:val="22"/>
         </w:rPr>
         <w:t xml:space="preserve">AI Evaluates Independently (Figure 5): </w:t>
       </w:r>
@@ -3444,7 +3444,7 @@
         <w:rPr>
           <w:rFonts w:ascii="Georgia" w:hAnsi="Georgia"/>
           <w:color w:val="1A202C"/>
-          <w:sz w:val="19"/>
+          <w:sz w:val="22"/>
         </w:rPr>
         <w:t>Sell-side human analyst forecast dispersion has near-zero correlation with AI model consensus (r = +0.026, p = 0.8537). AI consensus captures an independent quantitative perspective, untouched by corporate relationships or underwriting quotas.</w:t>
       </w:r>
@@ -3452,7 +3452,7 @@
     <w:p>
       <w:pPr>
         <w:pStyle w:val="ListBullet"/>
-        <w:spacing w:before="0" w:after="50" w:line="269" w:lineRule="auto"/>
+        <w:spacing w:before="0" w:after="50" w:line="293" w:lineRule="auto"/>
         <w:jc w:val="both"/>
       </w:pPr>
       <w:r>
@@ -3460,7 +3460,7 @@
           <w:rFonts w:ascii="Georgia" w:hAnsi="Georgia"/>
           <w:b/>
           <w:color w:val="051C2C"/>
-          <w:sz w:val="19"/>
+          <w:sz w:val="22"/>
         </w:rPr>
         <w:t xml:space="preserve">Macro Regimes Disrupt Model Alignment (Figure 6): </w:t>
       </w:r>
@@ -3468,7 +3468,7 @@
         <w:rPr>
           <w:rFonts w:ascii="Georgia" w:hAnsi="Georgia"/>
           <w:color w:val="1A202C"/>
-          <w:sz w:val="19"/>
+          <w:sz w:val="22"/>
         </w:rPr>
         <w:t>In quiet markets (mid-2024 VIX at 12.5–13.0), model consensus tightens (0.490–0.520). When macro volatility spikes (late 2022 VIX at 31.6; 2025/2026 spikes to 22.5–25.5), agreement drops sharply to 0.468 as valuation and risk personas clash.</w:t>
       </w:r>
@@ -3476,7 +3476,7 @@
     <w:p>
       <w:pPr>
         <w:pStyle w:val="ListBullet"/>
-        <w:spacing w:before="0" w:after="50" w:line="269" w:lineRule="auto"/>
+        <w:spacing w:before="0" w:after="50" w:line="293" w:lineRule="auto"/>
         <w:jc w:val="both"/>
       </w:pPr>
       <w:r>
@@ -3484,7 +3484,7 @@
           <w:rFonts w:ascii="Georgia" w:hAnsi="Georgia"/>
           <w:b/>
           <w:color w:val="051C2C"/>
-          <w:sz w:val="19"/>
+          <w:sz w:val="22"/>
         </w:rPr>
         <w:t xml:space="preserve">Why High p-values Matter: </w:t>
       </w:r>
@@ -3492,7 +3492,7 @@
         <w:rPr>
           <w:rFonts w:ascii="Georgia" w:hAnsi="Georgia"/>
           <w:color w:val="1A202C"/>
-          <w:sz w:val="19"/>
+          <w:sz w:val="22"/>
         </w:rPr>
         <w:t>With p-values above 0.05, we do not reject the null hypothesis. This proves that modern markets price in obvious algorithmic consensus rapidly. In large-cap stocks, unanimous AI conclusions leave zero free lunch.</w:t>
       </w:r>
@@ -3512,21 +3512,21 @@
           <w:rFonts w:ascii="Georgia" w:hAnsi="Georgia"/>
           <w:b/>
           <w:color w:val="051C2C"/>
-          <w:sz w:val="28"/>
+          <w:sz w:val="32"/>
         </w:rPr>
         <w:t>8. The Future: Asset Pricing Under AGI</w:t>
       </w:r>
     </w:p>
     <w:p>
       <w:pPr>
-        <w:spacing w:before="0" w:after="80" w:line="276" w:lineRule="auto"/>
+        <w:spacing w:before="0" w:after="80" w:line="300" w:lineRule="auto"/>
         <w:jc w:val="both"/>
       </w:pPr>
       <w:r>
         <w:rPr>
           <w:rFonts w:ascii="Georgia" w:hAnsi="Georgia"/>
           <w:color w:val="1A202C"/>
-          <w:sz w:val="19"/>
+          <w:sz w:val="22"/>
         </w:rPr>
         <w:t>Looking ahead from current LLMs to Artificial General Intelligence (AGI)—autonomous systems capable of continuous research and real-time reasoning—capital markets will split into two paths:</w:t>
       </w:r>
@@ -3681,21 +3681,21 @@
           <w:rFonts w:ascii="Georgia" w:hAnsi="Georgia"/>
           <w:b/>
           <w:color w:val="051C2C"/>
-          <w:sz w:val="22"/>
+          <w:sz w:val="26"/>
         </w:rPr>
         <w:t>Where Real Edge Survives</w:t>
       </w:r>
     </w:p>
     <w:p>
       <w:pPr>
-        <w:spacing w:before="0" w:after="80" w:line="276" w:lineRule="auto"/>
+        <w:spacing w:before="0" w:after="80" w:line="300" w:lineRule="auto"/>
         <w:jc w:val="both"/>
       </w:pPr>
       <w:r>
         <w:rPr>
           <w:rFonts w:ascii="Georgia" w:hAnsi="Georgia"/>
           <w:color w:val="1A202C"/>
-          <w:sz w:val="19"/>
+          <w:sz w:val="22"/>
         </w:rPr>
         <w:t>Under AGI, edge no longer comes from reading filings faster. Durable excess return shifts toward:</w:t>
       </w:r>
@@ -3703,7 +3703,7 @@
     <w:p>
       <w:pPr>
         <w:pStyle w:val="ListBullet"/>
-        <w:spacing w:before="0" w:after="50" w:line="269" w:lineRule="auto"/>
+        <w:spacing w:before="0" w:after="50" w:line="293" w:lineRule="auto"/>
         <w:jc w:val="both"/>
       </w:pPr>
       <w:r>
@@ -3711,7 +3711,7 @@
           <w:rFonts w:ascii="Georgia" w:hAnsi="Georgia"/>
           <w:b/>
           <w:color w:val="051C2C"/>
-          <w:sz w:val="19"/>
+          <w:sz w:val="22"/>
         </w:rPr>
         <w:t xml:space="preserve">Contrarian Liquidity Provision: </w:t>
       </w:r>
@@ -3719,7 +3719,7 @@
         <w:rPr>
           <w:rFonts w:ascii="Georgia" w:hAnsi="Georgia"/>
           <w:color w:val="1A202C"/>
-          <w:sz w:val="19"/>
+          <w:sz w:val="22"/>
         </w:rPr>
         <w:t>Having the capital and courage to buy when automated models trigger simultaneous forced sell-offs.</w:t>
       </w:r>
@@ -3727,7 +3727,7 @@
     <w:p>
       <w:pPr>
         <w:pStyle w:val="ListBullet"/>
-        <w:spacing w:before="0" w:after="50" w:line="269" w:lineRule="auto"/>
+        <w:spacing w:before="0" w:after="50" w:line="293" w:lineRule="auto"/>
         <w:jc w:val="both"/>
       </w:pPr>
       <w:r>
@@ -3735,7 +3735,7 @@
           <w:rFonts w:ascii="Georgia" w:hAnsi="Georgia"/>
           <w:b/>
           <w:color w:val="051C2C"/>
-          <w:sz w:val="19"/>
+          <w:sz w:val="22"/>
         </w:rPr>
         <w:t xml:space="preserve">Independent Quantitative Models: </w:t>
       </w:r>
@@ -3743,7 +3743,7 @@
         <w:rPr>
           <w:rFonts w:ascii="Georgia" w:hAnsi="Georgia"/>
           <w:color w:val="1A202C"/>
-          <w:sz w:val="19"/>
+          <w:sz w:val="22"/>
         </w:rPr>
         <w:t>Designing strategies explicitly engineered to have zero correlation with standard foundation model outputs.</w:t>
       </w:r>
@@ -3751,7 +3751,7 @@
     <w:p>
       <w:pPr>
         <w:pStyle w:val="ListBullet"/>
-        <w:spacing w:before="0" w:after="50" w:line="269" w:lineRule="auto"/>
+        <w:spacing w:before="0" w:after="50" w:line="293" w:lineRule="auto"/>
         <w:jc w:val="both"/>
       </w:pPr>
       <w:r>
@@ -3759,7 +3759,7 @@
           <w:rFonts w:ascii="Georgia" w:hAnsi="Georgia"/>
           <w:b/>
           <w:color w:val="051C2C"/>
-          <w:sz w:val="19"/>
+          <w:sz w:val="22"/>
         </w:rPr>
         <w:t xml:space="preserve">Physical Reality: </w:t>
       </w:r>
@@ -3767,7 +3767,7 @@
         <w:rPr>
           <w:rFonts w:ascii="Georgia" w:hAnsi="Georgia"/>
           <w:color w:val="1A202C"/>
-          <w:sz w:val="19"/>
+          <w:sz w:val="22"/>
         </w:rPr>
         <w:t>Focusing on emerging markets and opaque assets where business reality cannot be scraped from the web.</w:t>
       </w:r>
@@ -3787,21 +3787,21 @@
           <w:rFonts w:ascii="Georgia" w:hAnsi="Georgia"/>
           <w:b/>
           <w:color w:val="051C2C"/>
-          <w:sz w:val="28"/>
+          <w:sz w:val="32"/>
         </w:rPr>
         <w:t>9. The Indian Market: A Real-World Test</w:t>
       </w:r>
     </w:p>
     <w:p>
       <w:pPr>
-        <w:spacing w:before="0" w:after="80" w:line="276" w:lineRule="auto"/>
+        <w:spacing w:before="0" w:after="80" w:line="300" w:lineRule="auto"/>
         <w:jc w:val="both"/>
       </w:pPr>
       <w:r>
         <w:rPr>
           <w:rFonts w:ascii="Georgia" w:hAnsi="Georgia"/>
           <w:color w:val="1A202C"/>
-          <w:sz w:val="19"/>
+          <w:sz w:val="22"/>
         </w:rPr>
         <w:t>Applying our findings to the Indian stock market dramatically amplifies the gap between large-cap and small-cap efficiency (+0.21% vs. +1.37%). India represents a powerful counterweight to Western algorithmic monoculture.</w:t>
       </w:r>
@@ -3900,7 +3900,7 @@
           <w:rFonts w:ascii="Georgia" w:hAnsi="Georgia"/>
           <w:b/>
           <w:color w:val="051C2C"/>
-          <w:sz w:val="22"/>
+          <w:sz w:val="26"/>
         </w:rPr>
         <w:t>Large Caps vs. Small Caps</w:t>
       </w:r>
@@ -3908,7 +3908,7 @@
     <w:p>
       <w:pPr>
         <w:pStyle w:val="ListBullet"/>
-        <w:spacing w:before="0" w:after="50" w:line="269" w:lineRule="auto"/>
+        <w:spacing w:before="0" w:after="50" w:line="293" w:lineRule="auto"/>
         <w:jc w:val="both"/>
       </w:pPr>
       <w:r>
@@ -3916,7 +3916,7 @@
           <w:rFonts w:ascii="Georgia" w:hAnsi="Georgia"/>
           <w:b/>
           <w:color w:val="051C2C"/>
-          <w:sz w:val="19"/>
+          <w:sz w:val="22"/>
         </w:rPr>
         <w:t xml:space="preserve">Nifty 50 Hyper-Efficiency (H1 Validated): </w:t>
       </w:r>
@@ -3924,7 +3924,7 @@
         <w:rPr>
           <w:rFonts w:ascii="Georgia" w:hAnsi="Georgia"/>
           <w:color w:val="1A202C"/>
-          <w:sz w:val="19"/>
+          <w:sz w:val="22"/>
         </w:rPr>
         <w:t>The top 50 NSE stocks are covered by 30 to 50 global research desks and traded via co-located servers. Earnings filings are processed in milliseconds. Markets are highly efficient; extracting excess returns from unanimous AI consensus on TCS or Reliance is a zero-sum game, matching our large-cap findings (+0.21%).</w:t>
       </w:r>
@@ -3932,7 +3932,7 @@
     <w:p>
       <w:pPr>
         <w:pStyle w:val="ListBullet"/>
-        <w:spacing w:before="0" w:after="50" w:line="269" w:lineRule="auto"/>
+        <w:spacing w:before="0" w:after="50" w:line="293" w:lineRule="auto"/>
         <w:jc w:val="both"/>
       </w:pPr>
       <w:r>
@@ -3940,7 +3940,7 @@
           <w:rFonts w:ascii="Georgia" w:hAnsi="Georgia"/>
           <w:b/>
           <w:color w:val="051C2C"/>
-          <w:sz w:val="19"/>
+          <w:sz w:val="22"/>
         </w:rPr>
         <w:t xml:space="preserve">Nifty Smallcap 250 Opacity (H2 Amplified): </w:t>
       </w:r>
@@ -3948,7 +3948,7 @@
         <w:rPr>
           <w:rFonts w:ascii="Georgia" w:hAnsi="Georgia"/>
           <w:color w:val="1A202C"/>
-          <w:sz w:val="19"/>
+          <w:sz w:val="22"/>
         </w:rPr>
         <w:t>Over 1,000 listed stocks have fewer than two analysts, and hundreds have zero coverage. Here, AI disagreement highlights genuine information gaps, unmodeled turnarounds, and fragmented local dynamics—creating real alpha.</w:t>
       </w:r>
@@ -3956,7 +3956,7 @@
     <w:p>
       <w:pPr>
         <w:pStyle w:val="ListBullet"/>
-        <w:spacing w:before="0" w:after="50" w:line="269" w:lineRule="auto"/>
+        <w:spacing w:before="0" w:after="50" w:line="293" w:lineRule="auto"/>
         <w:jc w:val="both"/>
       </w:pPr>
       <w:r>
@@ -3964,7 +3964,7 @@
           <w:rFonts w:ascii="Georgia" w:hAnsi="Georgia"/>
           <w:b/>
           <w:color w:val="051C2C"/>
-          <w:sz w:val="19"/>
+          <w:sz w:val="22"/>
         </w:rPr>
         <w:t xml:space="preserve">The Trading Speed Paradox (Exhibit 3): </w:t>
       </w:r>
@@ -3972,7 +3972,7 @@
         <w:rPr>
           <w:rFonts w:ascii="Georgia" w:hAnsi="Georgia"/>
           <w:color w:val="1A202C"/>
-          <w:sz w:val="19"/>
+          <w:sz w:val="22"/>
         </w:rPr>
         <w:t>The NSE is the world's largest derivatives exchange, with 60% of cash volume run by algorithms. But these algorithms trade sub-second weekly index options—they do not price multi-quarter fundamental company health.</w:t>
       </w:r>
@@ -3987,7 +3987,7 @@
           <w:rFonts w:ascii="Georgia" w:hAnsi="Georgia"/>
           <w:b/>
           <w:color w:val="051C2C"/>
-          <w:sz w:val="22"/>
+          <w:sz w:val="26"/>
         </w:rPr>
         <w:t>The Retail SIP Defense &amp; Ground Reality</w:t>
       </w:r>
@@ -3995,7 +3995,7 @@
     <w:p>
       <w:pPr>
         <w:pStyle w:val="ListBullet"/>
-        <w:spacing w:before="0" w:after="50" w:line="269" w:lineRule="auto"/>
+        <w:spacing w:before="0" w:after="50" w:line="293" w:lineRule="auto"/>
         <w:jc w:val="both"/>
       </w:pPr>
       <w:r>
@@ -4003,7 +4003,7 @@
           <w:rFonts w:ascii="Georgia" w:hAnsi="Georgia"/>
           <w:b/>
           <w:color w:val="051C2C"/>
-          <w:sz w:val="19"/>
+          <w:sz w:val="22"/>
         </w:rPr>
         <w:t xml:space="preserve">The Retail SIP Wall (₹20,000+ Cr / $2.5B+ Monthly): </w:t>
       </w:r>
@@ -4011,7 +4011,7 @@
         <w:rPr>
           <w:rFonts w:ascii="Georgia" w:hAnsi="Georgia"/>
           <w:color w:val="1A202C"/>
-          <w:sz w:val="19"/>
+          <w:sz w:val="22"/>
         </w:rPr>
         <w:t>Indian retail investors invest over ₹20,000 Crore programmatically every month into mutual funds through Systematic Investment Plans (SIPs) across 100M+ folios. Historically, emerging markets crashed when foreign funds sold. Today, continuous domestic SIP flows absorb foreign selling and maintain an environment where active Indian stock-pickers routinely generate 300–500 bps of alpha.</w:t>
       </w:r>
@@ -4019,7 +4019,7 @@
     <w:p>
       <w:pPr>
         <w:pStyle w:val="ListBullet"/>
-        <w:spacing w:before="0" w:after="50" w:line="269" w:lineRule="auto"/>
+        <w:spacing w:before="0" w:after="50" w:line="293" w:lineRule="auto"/>
         <w:jc w:val="both"/>
       </w:pPr>
       <w:r>
@@ -4027,7 +4027,7 @@
           <w:rFonts w:ascii="Georgia" w:hAnsi="Georgia"/>
           <w:b/>
           <w:color w:val="051C2C"/>
-          <w:sz w:val="19"/>
+          <w:sz w:val="22"/>
         </w:rPr>
         <w:t xml:space="preserve">Promoter Pledging Risks: </w:t>
       </w:r>
@@ -4035,7 +4035,7 @@
         <w:rPr>
           <w:rFonts w:ascii="Georgia" w:hAnsi="Georgia"/>
           <w:color w:val="1A202C"/>
-          <w:sz w:val="19"/>
+          <w:sz w:val="22"/>
         </w:rPr>
         <w:t>Over 50% of listed mid caps are controlled by founding families. If a promoter secretly pledges shares to fund private ventures, headline earnings look fine while the stock faces catastrophic margin-call risks that AI scrapers cannot see.</w:t>
       </w:r>
@@ -4043,7 +4043,7 @@
     <w:p>
       <w:pPr>
         <w:pStyle w:val="ListBullet"/>
-        <w:spacing w:before="0" w:after="50" w:line="269" w:lineRule="auto"/>
+        <w:spacing w:before="0" w:after="50" w:line="293" w:lineRule="auto"/>
         <w:jc w:val="both"/>
       </w:pPr>
       <w:r>
@@ -4051,7 +4051,7 @@
           <w:rFonts w:ascii="Georgia" w:hAnsi="Georgia"/>
           <w:b/>
           <w:color w:val="051C2C"/>
-          <w:sz w:val="19"/>
+          <w:sz w:val="22"/>
         </w:rPr>
         <w:t xml:space="preserve">Physical Scuttlebutt Still Wins: </w:t>
       </w:r>
@@ -4059,7 +4059,7 @@
         <w:rPr>
           <w:rFonts w:ascii="Georgia" w:hAnsi="Georgia"/>
           <w:color w:val="1A202C"/>
-          <w:sz w:val="19"/>
+          <w:sz w:val="22"/>
         </w:rPr>
         <w:t>True fundamental edge requires Philip Fisher's classic scuttlebutt: counting truck dispatches at factory gates in Dahej or conducting distributor checks in Kanpur and Surat—information vectors completely immune to web scraping.</w:t>
       </w:r>
@@ -4079,7 +4079,7 @@
           <w:rFonts w:ascii="Georgia" w:hAnsi="Georgia"/>
           <w:b/>
           <w:color w:val="051C2C"/>
-          <w:sz w:val="28"/>
+          <w:sz w:val="32"/>
         </w:rPr>
         <w:t>10. Strategic Conclusion &amp; Practical Roadmap</w:t>
       </w:r>
@@ -4160,7 +4160,7 @@
           <w:rFonts w:ascii="Georgia" w:hAnsi="Georgia"/>
           <w:b/>
           <w:color w:val="051C2C"/>
-          <w:sz w:val="22"/>
+          <w:sz w:val="26"/>
         </w:rPr>
         <w:t>Four Rules for Investors</w:t>
       </w:r>
@@ -4168,7 +4168,7 @@
     <w:p>
       <w:pPr>
         <w:pStyle w:val="ListBullet"/>
-        <w:spacing w:before="0" w:after="50" w:line="269" w:lineRule="auto"/>
+        <w:spacing w:before="0" w:after="50" w:line="293" w:lineRule="auto"/>
         <w:jc w:val="both"/>
       </w:pPr>
       <w:r>
@@ -4176,7 +4176,7 @@
           <w:rFonts w:ascii="Georgia" w:hAnsi="Georgia"/>
           <w:b/>
           <w:color w:val="051C2C"/>
-          <w:sz w:val="19"/>
+          <w:sz w:val="22"/>
         </w:rPr>
         <w:t xml:space="preserve">1. Stop Chasing "Faster AI": </w:t>
       </w:r>
@@ -4184,7 +4184,7 @@
         <w:rPr>
           <w:rFonts w:ascii="Georgia" w:hAnsi="Georgia"/>
           <w:color w:val="1A202C"/>
-          <w:sz w:val="19"/>
+          <w:sz w:val="22"/>
         </w:rPr>
         <w:t>Spending millions to build an AI that reads company filings 5 milliseconds faster is a losing race. As our empirical data proves, consensus information is absorbed by electronic markets almost instantly, leaving virtually zero spread in large caps (+0.21%, t = 0.103, p = 0.9178). Competing on raw parsing speed produces zero net profit after compute costs.</w:t>
       </w:r>
@@ -4192,7 +4192,7 @@
     <w:p>
       <w:pPr>
         <w:pStyle w:val="ListBullet"/>
-        <w:spacing w:before="0" w:after="50" w:line="269" w:lineRule="auto"/>
+        <w:spacing w:before="0" w:after="50" w:line="293" w:lineRule="auto"/>
         <w:jc w:val="both"/>
       </w:pPr>
       <w:r>
@@ -4200,7 +4200,7 @@
           <w:rFonts w:ascii="Georgia" w:hAnsi="Georgia"/>
           <w:b/>
           <w:color w:val="051C2C"/>
-          <w:sz w:val="19"/>
+          <w:sz w:val="22"/>
         </w:rPr>
         <w:t xml:space="preserve">2. Embrace Controversy (Disagreement Pays): </w:t>
       </w:r>
@@ -4208,7 +4208,7 @@
         <w:rPr>
           <w:rFonts w:ascii="Georgia" w:hAnsi="Georgia"/>
           <w:color w:val="1A202C"/>
-          <w:sz w:val="19"/>
+          <w:sz w:val="22"/>
         </w:rPr>
         <w:t>Across 960 evaluations over 4 years, stocks with high AI disagreement delivered a +178.4% cumulative return, outperforming high-agreement stocks (+148.7%) by 29.7 percentage points and beating the S&amp;P 500 (+101.9%) by 76.5 percentage points. Disagreement is not noise; it highlights complexity and uncertainty where standard models clash—and the market pays an excess return for bearing that controversy.</w:t>
       </w:r>
@@ -4216,7 +4216,7 @@
     <w:p>
       <w:pPr>
         <w:pStyle w:val="ListBullet"/>
-        <w:spacing w:before="0" w:after="50" w:line="269" w:lineRule="auto"/>
+        <w:spacing w:before="0" w:after="50" w:line="293" w:lineRule="auto"/>
         <w:jc w:val="both"/>
       </w:pPr>
       <w:r>
@@ -4224,7 +4224,7 @@
           <w:rFonts w:ascii="Georgia" w:hAnsi="Georgia"/>
           <w:b/>
           <w:color w:val="051C2C"/>
-          <w:sz w:val="19"/>
+          <w:sz w:val="22"/>
         </w:rPr>
         <w:t xml:space="preserve">3. Beware the Algorithmic Herd: </w:t>
       </w:r>
@@ -4232,7 +4232,7 @@
         <w:rPr>
           <w:rFonts w:ascii="Georgia" w:hAnsi="Georgia"/>
           <w:color w:val="1A202C"/>
-          <w:sz w:val="19"/>
+          <w:sz w:val="22"/>
         </w:rPr>
         <w:t>When funds run similar models trained on similar data, they end up holding correlated portfolios. When a macro shock hits, identical stop-losses trigger synchronized selling and flash crashes. Durable edge requires building quantitative models that are intentionally independent (r ≈ 0) from standard LLM consensus.</w:t>
       </w:r>
@@ -4240,7 +4240,7 @@
     <w:p>
       <w:pPr>
         <w:pStyle w:val="ListBullet"/>
-        <w:spacing w:before="0" w:after="50" w:line="269" w:lineRule="auto"/>
+        <w:spacing w:before="0" w:after="50" w:line="293" w:lineRule="auto"/>
         <w:jc w:val="both"/>
       </w:pPr>
       <w:r>
@@ -4248,7 +4248,7 @@
           <w:rFonts w:ascii="Georgia" w:hAnsi="Georgia"/>
           <w:b/>
           <w:color w:val="051C2C"/>
-          <w:sz w:val="19"/>
+          <w:sz w:val="22"/>
         </w:rPr>
         <w:t xml:space="preserve">4. Go Where AI Cannot See: </w:t>
       </w:r>
@@ -4256,7 +4256,7 @@
         <w:rPr>
           <w:rFonts w:ascii="Georgia" w:hAnsi="Georgia"/>
           <w:color w:val="1A202C"/>
-          <w:sz w:val="19"/>
+          <w:sz w:val="22"/>
         </w:rPr>
         <w:t>Real informational edge has moved away from online text to physical ground reality: counting factory gate dispatches, checking dealer networks, forensic promoter governance analysis, and trading against retail liquidity flows (like the ₹20,000+ Cr/month Indian SIP wall). Human judgment grounded in physical reality remains irreplaceable.</w:t>
       </w:r>
@@ -4271,7 +4271,7 @@
           <w:rFonts w:ascii="Georgia" w:hAnsi="Georgia"/>
           <w:b/>
           <w:color w:val="051C2C"/>
-          <w:sz w:val="22"/>
+          <w:sz w:val="26"/>
         </w:rPr>
         <w:t>Study Scope &amp; Limitations</w:t>
       </w:r>
@@ -4279,7 +4279,7 @@
     <w:p>
       <w:pPr>
         <w:pStyle w:val="ListBullet"/>
-        <w:spacing w:before="0" w:after="50" w:line="269" w:lineRule="auto"/>
+        <w:spacing w:before="0" w:after="50" w:line="293" w:lineRule="auto"/>
         <w:jc w:val="both"/>
       </w:pPr>
       <w:r>
@@ -4287,7 +4287,7 @@
           <w:rFonts w:ascii="Georgia" w:hAnsi="Georgia"/>
           <w:b/>
           <w:color w:val="051C2C"/>
-          <w:sz w:val="19"/>
+          <w:sz w:val="22"/>
         </w:rPr>
         <w:t xml:space="preserve">1. Calibrated Model Personas: </w:t>
       </w:r>
@@ -4295,7 +4295,7 @@
         <w:rPr>
           <w:rFonts w:ascii="Georgia" w:hAnsi="Georgia"/>
           <w:color w:val="1A202C"/>
-          <w:sz w:val="19"/>
+          <w:sz w:val="22"/>
         </w:rPr>
         <w:t>Tested with 4 stylized deterministic personas (Momentum, Value, Quality, Macro) to ensure strict mathematical repeatability across 960 evaluations.</w:t>
       </w:r>
@@ -4303,7 +4303,7 @@
     <w:p>
       <w:pPr>
         <w:pStyle w:val="ListBullet"/>
-        <w:spacing w:before="0" w:after="50" w:line="269" w:lineRule="auto"/>
+        <w:spacing w:before="0" w:after="50" w:line="293" w:lineRule="auto"/>
         <w:jc w:val="both"/>
       </w:pPr>
       <w:r>
@@ -4311,7 +4311,7 @@
           <w:rFonts w:ascii="Georgia" w:hAnsi="Georgia"/>
           <w:b/>
           <w:color w:val="051C2C"/>
-          <w:sz w:val="19"/>
+          <w:sz w:val="22"/>
         </w:rPr>
         <w:t xml:space="preserve">2. Time Horizon &amp; Sample: </w:t>
       </w:r>
@@ -4319,7 +4319,7 @@
         <w:rPr>
           <w:rFonts w:ascii="Georgia" w:hAnsi="Georgia"/>
           <w:color w:val="1A202C"/>
-          <w:sz w:val="19"/>
+          <w:sz w:val="22"/>
         </w:rPr>
         <w:t>Covers 60 equities across 16 quarters (2022–2026). Future research should expand across the Russell 3000 over multi-decade cycles.</w:t>
       </w:r>
@@ -4327,7 +4327,7 @@
     <w:p>
       <w:pPr>
         <w:pStyle w:val="ListBullet"/>
-        <w:spacing w:before="0" w:after="50" w:line="269" w:lineRule="auto"/>
+        <w:spacing w:before="0" w:after="50" w:line="293" w:lineRule="auto"/>
         <w:jc w:val="both"/>
       </w:pPr>
       <w:r>
@@ -4335,7 +4335,7 @@
           <w:rFonts w:ascii="Georgia" w:hAnsi="Georgia"/>
           <w:b/>
           <w:color w:val="051C2C"/>
-          <w:sz w:val="19"/>
+          <w:sz w:val="22"/>
         </w:rPr>
         <w:t xml:space="preserve">3. Fixed Weights: </w:t>
       </w:r>
@@ -4343,7 +4343,7 @@
         <w:rPr>
           <w:rFonts w:ascii="Georgia" w:hAnsi="Georgia"/>
           <w:color w:val="1A202C"/>
-          <w:sz w:val="19"/>
+          <w:sz w:val="22"/>
         </w:rPr>
         <w:t>The Consensus Index uses fixed weights (w_d = 0.60, w_t = 0.40). Dynamic weighting across volatility regimes is an active research area.</w:t>
       </w:r>
@@ -4351,7 +4351,7 @@
     <w:p>
       <w:pPr>
         <w:pStyle w:val="ListBullet"/>
-        <w:spacing w:before="0" w:after="50" w:line="269" w:lineRule="auto"/>
+        <w:spacing w:before="0" w:after="50" w:line="293" w:lineRule="auto"/>
         <w:jc w:val="both"/>
       </w:pPr>
       <w:r>
@@ -4359,7 +4359,7 @@
           <w:rFonts w:ascii="Georgia" w:hAnsi="Georgia"/>
           <w:b/>
           <w:color w:val="051C2C"/>
-          <w:sz w:val="19"/>
+          <w:sz w:val="22"/>
         </w:rPr>
         <w:t xml:space="preserve">4. Trading Costs: </w:t>
       </w:r>
@@ -4367,7 +4367,7 @@
         <w:rPr>
           <w:rFonts w:ascii="Georgia" w:hAnsi="Georgia"/>
           <w:color w:val="1A202C"/>
-          <w:sz w:val="19"/>
+          <w:sz w:val="22"/>
         </w:rPr>
         <w:t>While the Small-Cap spread (+1.37%) survives transaction costs up to 50 bps, the Large-Cap spread (+0.21%) disappears with fees above 18 bps.</w:t>
       </w:r>
@@ -4375,7 +4375,7 @@
     <w:p>
       <w:pPr>
         <w:pStyle w:val="ListBullet"/>
-        <w:spacing w:before="0" w:after="50" w:line="269" w:lineRule="auto"/>
+        <w:spacing w:before="0" w:after="50" w:line="293" w:lineRule="auto"/>
         <w:jc w:val="both"/>
       </w:pPr>
       <w:r>
@@ -4383,7 +4383,7 @@
           <w:rFonts w:ascii="Georgia" w:hAnsi="Georgia"/>
           <w:b/>
           <w:color w:val="051C2C"/>
-          <w:sz w:val="19"/>
+          <w:sz w:val="22"/>
         </w:rPr>
         <w:t xml:space="preserve">5. Data Coverage: </w:t>
       </w:r>
@@ -4391,7 +4391,7 @@
         <w:rPr>
           <w:rFonts w:ascii="Georgia" w:hAnsi="Georgia"/>
           <w:color w:val="1A202C"/>
-          <w:sz w:val="19"/>
+          <w:sz w:val="22"/>
         </w:rPr>
         <w:t>4 small-cap stocks were excluded from dispersion tests due to missing sell-side target prices on Yahoo Finance (N = 54).</w:t>
       </w:r>
@@ -4399,7 +4399,7 @@
     <w:p>
       <w:pPr>
         <w:pStyle w:val="ListBullet"/>
-        <w:spacing w:before="0" w:after="50" w:line="269" w:lineRule="auto"/>
+        <w:spacing w:before="0" w:after="50" w:line="293" w:lineRule="auto"/>
         <w:jc w:val="both"/>
       </w:pPr>
       <w:r>
@@ -4407,7 +4407,7 @@
           <w:rFonts w:ascii="Georgia" w:hAnsi="Georgia"/>
           <w:b/>
           <w:color w:val="051C2C"/>
-          <w:sz w:val="19"/>
+          <w:sz w:val="22"/>
         </w:rPr>
         <w:t xml:space="preserve">Technical Documentation: </w:t>
       </w:r>
@@ -4415,7 +4415,7 @@
         <w:rPr>
           <w:rFonts w:ascii="Georgia" w:hAnsi="Georgia"/>
           <w:color w:val="1A202C"/>
-          <w:sz w:val="19"/>
+          <w:sz w:val="22"/>
         </w:rPr>
         <w:t>Full mathematical derivations, Satterthwaite proofs, and all 22 annotated academic citations are preserved in technical_appendices.md and references.md.</w:t>
       </w:r>

</xml_diff>

<commit_message>
Update Page 11: replace .md file references with companion appendices/citations PDF and attach GitHub repository link
</commit_message>
<xml_diff>
--- a/report.docx
+++ b/report.docx
@@ -4409,7 +4409,7 @@
           <w:color w:val="051C2C"/>
           <w:sz w:val="22"/>
         </w:rPr>
-        <w:t xml:space="preserve">Technical Documentation: </w:t>
+        <w:t xml:space="preserve">6. Appendices &amp; Citations: </w:t>
       </w:r>
       <w:r>
         <w:rPr>
@@ -4417,8 +4417,74 @@
           <w:color w:val="1A202C"/>
           <w:sz w:val="22"/>
         </w:rPr>
-        <w:t>Full mathematical derivations, Satterthwaite proofs, and all 22 annotated academic citations are preserved in technical_appendices.md and references.md.</w:t>
+        <w:t>Full mathematical derivations, econometric proofs, and all 22 annotated academic citations are provided in the companion Technical Appendices &amp; Citations document (PDF).</w:t>
       </w:r>
+    </w:p>
+    <w:tbl>
+      <w:tblPr>
+        <w:tblW w:type="auto" w:w="0"/>
+        <w:jc w:val="center"/>
+        <w:tblLayout w:type="fixed"/>
+        <w:tblLook w:firstColumn="1" w:firstRow="1" w:lastColumn="0" w:lastRow="0" w:noHBand="0" w:noVBand="1" w:val="04A0"/>
+      </w:tblPr>
+      <w:tblGrid>
+        <w:gridCol w:w="10080"/>
+      </w:tblGrid>
+      <w:tr>
+        <w:tc>
+          <w:tcPr>
+            <w:tcW w:type="dxa" w:w="10080"/>
+            <w:shd w:fill="F4F7FA"/>
+            <w:tcMar>
+              <w:top w:w="100" w:type="dxa"/>
+              <w:bottom w:w="100" w:type="dxa"/>
+              <w:left w:w="160" w:type="dxa"/>
+              <w:right w:w="140" w:type="dxa"/>
+            </w:tcMar>
+            <w:tcBorders>
+              <w:top w:val="none"/>
+              <w:left w:val="single" w:sz="36" w:space="0" w:color="1F65AE"/>
+              <w:bottom w:val="none"/>
+              <w:right w:val="none"/>
+            </w:tcBorders>
+          </w:tcPr>
+          <w:p>
+            <w:pPr>
+              <w:spacing w:before="0" w:after="40"/>
+            </w:pPr>
+            <w:r>
+              <w:rPr>
+                <w:rFonts w:ascii="Arial" w:hAnsi="Arial"/>
+                <w:b/>
+                <w:color w:val="1F65AE"/>
+                <w:sz w:val="16"/>
+              </w:rPr>
+              <w:t>RESEARCH REPLICATION &amp; CODE REPOSITORY</w:t>
+            </w:r>
+          </w:p>
+          <w:p>
+            <w:pPr>
+              <w:spacing w:before="40" w:after="0" w:line="276" w:lineRule="auto"/>
+              <w:jc w:val="both"/>
+            </w:pPr>
+            <w:r>
+              <w:rPr>
+                <w:rFonts w:ascii="Georgia" w:hAnsi="Georgia"/>
+                <w:color w:val="1A202C"/>
+                <w:sz w:val="18"/>
+              </w:rPr>
+              <w:t>https://github.com/Parth777777/ai-model-consensus-market-efficiency</w:t>
+              <w:br/>
+              <w:t>Companion Technical Appendices, Citations PDF &amp; Full Simulation Pipeline Available Online.</w:t>
+            </w:r>
+          </w:p>
+        </w:tc>
+      </w:tr>
+    </w:tbl>
+    <w:p>
+      <w:pPr>
+        <w:spacing w:before="0" w:after="80"/>
+      </w:pPr>
     </w:p>
     <w:sectPr>
       <w:headerReference w:type="default" r:id="rId9"/>

</xml_diff>